<commit_message>
Add network Settings modal and config
Introduce a configurable network settings panel: add DEFAULT_NETWORK_CONFIG and load/save to localStorage, plus a SettingsModal component for editing network name, subnet, DHCP/static ranges and fixed DHCP reservations (with validation and preview). Wire networkConfig into state and replace hard-coded NETWORK_CONFIG usage across the app (stats, helpers, UI labels). Add Settings button in the header to open the modal and render dynamic network info (name, subnet, DHCP/static ranges, fixed IP list). Update README to mention the built-in Settings panel and update the roadmap document.
</commit_message>
<xml_diff>
--- a/IP_Manager_Roadmap.docx
+++ b/IP_Manager_Roadmap.docx
@@ -96,7 +96,7 @@
           <w:sz w:val="22"/>
           <w:szCs w:val="22"/>
         </w:rPr>
-        <w:t xml:space="preserve">The IP Address Manager started as a static Excel spreadsheet used to track home network assignments across servers, containers, cameras, and networking equipment. It has evolved into an interactive React web application with real-time search, editable entries, free IP claiming, and Excel export.</w:t>
+        <w:t xml:space="preserve">The IP Address Manager started as a static Excel spreadsheet used to track home network assignments across servers, containers, cameras, and networking equipment. It has evolved into an interactive React web application with real-time search, editable entries, free IP claiming, Excel export, and a built-in Settings panel so any user can configure their own network ranges without touching the source code.</w:t>
       </w:r>
     </w:p>
     <w:p>
@@ -327,7 +327,64 @@
           <w:sz w:val="22"/>
           <w:szCs w:val="22"/>
         </w:rPr>
+        <w:t xml:space="preserve">Network Settings panel — configure subnet, DHCP/static ranges, and fixed IPs via the UI — no code editing required</w:t>
+      </w:r>
+    </w:p>
+    <w:p>
+      <w:pPr>
+        <w:pStyle w:val="ListParagraph"/>
+        <w:numPr>
+          <w:ilvl w:val="0"/>
+          <w:numId w:val="2"/>
+        </w:numPr>
+        <w:spacing w:after="40" w:before="40"/>
+      </w:pPr>
+      <w:r>
+        <w:rPr>
+          <w:rFonts w:ascii="Arial" w:cs="Arial" w:eastAsia="Arial" w:hAnsi="Arial"/>
+          <w:color w:val="1E293B"/>
+          <w:sz w:val="22"/>
+          <w:szCs w:val="22"/>
+        </w:rPr>
+        <w:t xml:space="preserve">Settings persist across sessions via localStorage</w:t>
+      </w:r>
+    </w:p>
+    <w:p>
+      <w:pPr>
+        <w:pStyle w:val="ListParagraph"/>
+        <w:numPr>
+          <w:ilvl w:val="0"/>
+          <w:numId w:val="2"/>
+        </w:numPr>
+        <w:spacing w:after="40" w:before="40"/>
+      </w:pPr>
+      <w:r>
+        <w:rPr>
+          <w:rFonts w:ascii="Arial" w:cs="Arial" w:eastAsia="Arial" w:hAnsi="Arial"/>
+          <w:color w:val="1E293B"/>
+          <w:sz w:val="22"/>
+          <w:szCs w:val="22"/>
+        </w:rPr>
         <w:t xml:space="preserve">Deployed as a Vite + React project, hosted locally on npm run dev</w:t>
+      </w:r>
+    </w:p>
+    <w:p>
+      <w:pPr>
+        <w:pStyle w:val="ListParagraph"/>
+        <w:numPr>
+          <w:ilvl w:val="0"/>
+          <w:numId w:val="2"/>
+        </w:numPr>
+        <w:spacing w:after="40" w:before="40"/>
+      </w:pPr>
+      <w:r>
+        <w:rPr>
+          <w:rFonts w:ascii="Arial" w:cs="Arial" w:eastAsia="Arial" w:hAnsi="Arial"/>
+          <w:color w:val="1E293B"/>
+          <w:sz w:val="22"/>
+          <w:szCs w:val="22"/>
+        </w:rPr>
+        <w:t xml:space="preserve">LXC one-script installer for Proxmox (Ubuntu 24.04 + Nginx)</w:t>
       </w:r>
     </w:p>
     <w:p>
@@ -475,7 +532,7 @@
           <w:sz w:val="22"/>
           <w:szCs w:val="22"/>
         </w:rPr>
-        <w:t xml:space="preserve">These improvements address the most immediate limitations of v1.0 — chief among them the fact that edits are lost when the browser tab is closed. Phase 1 is low effort, high impact.</w:t>
+        <w:t xml:space="preserve">These improvements address the most immediate limitations of v1.0 — chief among them the fact that edits are lost when the browser tab is closed. Network configuration is already addressed via the Settings panel shipped in v1.0. Phase 1 is low effort, high impact.</w:t>
       </w:r>
     </w:p>
     <w:p>

</xml_diff>

<commit_message>
Add Express/SQLite API and update installer
Introduce a Node/Express API backed by SQLite and wire it into the deployment flow. Adds a new server/ directory with index.js and package.json, creates a systemd service (ip-manager-api), and updates install.sh to install server deps, build frontend, install server packages, start the API service, and add an Nginx proxy for /api/ to 127.0.0.1:3001. README.md updated to document data persistence modes (SQLite vs localStorage), settings UI, and deployment/update steps. Also adds package-lock.json and timestamped Vite config files; small frontend changes in src/IPAddressManager.jsx to support the server mode.
</commit_message>
<xml_diff>
--- a/IP_Manager_Roadmap.docx
+++ b/IP_Manager_Roadmap.docx
@@ -96,7 +96,7 @@
           <w:sz w:val="22"/>
           <w:szCs w:val="22"/>
         </w:rPr>
-        <w:t xml:space="preserve">The IP Address Manager started as a static Excel spreadsheet used to track home network assignments across servers, containers, cameras, and networking equipment. It has evolved into an interactive React web application with real-time search, editable entries, free IP claiming, Excel export, and a built-in Settings panel so any user can configure their own network ranges without touching the source code.</w:t>
+        <w:t xml:space="preserve">The IP Address Manager started as a static Excel spreadsheet used to track home network assignments across servers, containers, cameras, and networking equipment. It has evolved into a full-stack React web application with a SQLite backend, real-time search, editable entries, free IP claiming, Excel export, and a built-in Settings panel — deployable as a shared tool for the whole household.</w:t>
       </w:r>
     </w:p>
     <w:p>
@@ -137,7 +137,7 @@
           <w:sz w:val="36"/>
           <w:szCs w:val="36"/>
         </w:rPr>
-        <w:t xml:space="preserve">Current State (v1.0)</w:t>
+        <w:t xml:space="preserve">Current State (v1.2)</w:t>
       </w:r>
     </w:p>
     <w:p>
@@ -308,7 +308,45 @@
           <w:sz w:val="22"/>
           <w:szCs w:val="22"/>
         </w:rPr>
-        <w:t xml:space="preserve">Unsaved changes indicator</w:t>
+        <w:t xml:space="preserve">SQLite backend — shared server-side database via Node/Express API; data is consistent across all users and browsers</w:t>
+      </w:r>
+    </w:p>
+    <w:p>
+      <w:pPr>
+        <w:pStyle w:val="ListParagraph"/>
+        <w:numPr>
+          <w:ilvl w:val="0"/>
+          <w:numId w:val="2"/>
+        </w:numPr>
+        <w:spacing w:after="40" w:before="40"/>
+      </w:pPr>
+      <w:r>
+        <w:rPr>
+          <w:rFonts w:ascii="Arial" w:cs="Arial" w:eastAsia="Arial" w:hAnsi="Arial"/>
+          <w:color w:val="1E293B"/>
+          <w:sz w:val="22"/>
+          <w:szCs w:val="22"/>
+        </w:rPr>
+        <w:t xml:space="preserve">Automatic API detection — app detects the server on startup and switches to SQLite mode; falls back to localStorage for local dev</w:t>
+      </w:r>
+    </w:p>
+    <w:p>
+      <w:pPr>
+        <w:pStyle w:val="ListParagraph"/>
+        <w:numPr>
+          <w:ilvl w:val="0"/>
+          <w:numId w:val="2"/>
+        </w:numPr>
+        <w:spacing w:after="40" w:before="40"/>
+      </w:pPr>
+      <w:r>
+        <w:rPr>
+          <w:rFonts w:ascii="Arial" w:cs="Arial" w:eastAsia="Arial" w:hAnsi="Arial"/>
+          <w:color w:val="1E293B"/>
+          <w:sz w:val="22"/>
+          <w:szCs w:val="22"/>
+        </w:rPr>
+        <w:t xml:space="preserve">Persistence mode indicator in the header (SQLite vs Local)</w:t>
       </w:r>
     </w:p>
     <w:p>
@@ -346,7 +384,7 @@
           <w:sz w:val="22"/>
           <w:szCs w:val="22"/>
         </w:rPr>
-        <w:t xml:space="preserve">Settings persist across sessions via localStorage</w:t>
+        <w:t xml:space="preserve">Deployed as a Vite + React project with a separate Express API server</w:t>
       </w:r>
     </w:p>
     <w:p>
@@ -365,26 +403,7 @@
           <w:sz w:val="22"/>
           <w:szCs w:val="22"/>
         </w:rPr>
-        <w:t xml:space="preserve">Deployed as a Vite + React project, hosted locally on npm run dev</w:t>
-      </w:r>
-    </w:p>
-    <w:p>
-      <w:pPr>
-        <w:pStyle w:val="ListParagraph"/>
-        <w:numPr>
-          <w:ilvl w:val="0"/>
-          <w:numId w:val="2"/>
-        </w:numPr>
-        <w:spacing w:after="40" w:before="40"/>
-      </w:pPr>
-      <w:r>
-        <w:rPr>
-          <w:rFonts w:ascii="Arial" w:cs="Arial" w:eastAsia="Arial" w:hAnsi="Arial"/>
-          <w:color w:val="1E293B"/>
-          <w:sz w:val="22"/>
-          <w:szCs w:val="22"/>
-        </w:rPr>
-        <w:t xml:space="preserve">LXC one-script installer for Proxmox (Ubuntu 24.04 + Nginx)</w:t>
+        <w:t xml:space="preserve">LXC one-script installer for Proxmox (Ubuntu 24.04 + Nginx + systemd)</w:t>
       </w:r>
     </w:p>
     <w:p>
@@ -532,7 +551,7 @@
           <w:sz w:val="22"/>
           <w:szCs w:val="22"/>
         </w:rPr>
-        <w:t xml:space="preserve">These improvements address the most immediate limitations of v1.0 — chief among them the fact that edits are lost when the browser tab is closed. Network configuration is already addressed via the Settings panel shipped in v1.0. Phase 1 is low effort, high impact.</w:t>
+        <w:t xml:space="preserve">These improvements build on a solid v1.2 foundation. Persistence (SQLite), network configuration, and multi-user support are already shipped — Phase 1 focuses on data portability, discoverability, and power-user ergonomics. All items are low effort, high impact.</w:t>
       </w:r>
     </w:p>
     <w:p>
@@ -648,104 +667,6 @@
                 <w:szCs w:val="18"/>
               </w:rPr>
               <w:t xml:space="preserve">Impact</w:t>
-            </w:r>
-          </w:p>
-        </w:tc>
-      </w:tr>
-      <w:tr>
-        <w:tc>
-          <w:tcPr>
-            <w:tcW w:type="dxa" w:w="2800"/>
-            <w:tcBorders>
-              <w:top w:val="single" w:color="E2E8F0" w:sz="1"/>
-              <w:left w:val="single" w:color="E2E8F0" w:sz="1"/>
-              <w:bottom w:val="single" w:color="E2E8F0" w:sz="1"/>
-              <w:right w:val="single" w:color="E2E8F0" w:sz="1"/>
-            </w:tcBorders>
-            <w:shd w:fill="FFFFFF" w:val="clear"/>
-            <w:tcMar>
-              <w:top w:type="dxa" w:w="80"/>
-              <w:left w:type="dxa" w:w="120"/>
-              <w:bottom w:type="dxa" w:w="80"/>
-              <w:right w:type="dxa" w:w="120"/>
-            </w:tcMar>
-          </w:tcPr>
-          <w:p>
-            <w:r>
-              <w:rPr>
-                <w:rFonts w:ascii="Arial" w:cs="Arial" w:eastAsia="Arial" w:hAnsi="Arial"/>
-                <w:b/>
-                <w:bCs/>
-                <w:color w:val="1E293B"/>
-                <w:sz w:val="20"/>
-                <w:szCs w:val="20"/>
-              </w:rPr>
-              <w:t xml:space="preserve">Local Persistence</w:t>
-            </w:r>
-          </w:p>
-        </w:tc>
-        <w:tc>
-          <w:tcPr>
-            <w:tcW w:type="dxa" w:w="4560"/>
-            <w:tcBorders>
-              <w:top w:val="single" w:color="E2E8F0" w:sz="1"/>
-              <w:left w:val="single" w:color="E2E8F0" w:sz="1"/>
-              <w:bottom w:val="single" w:color="E2E8F0" w:sz="1"/>
-              <w:right w:val="single" w:color="E2E8F0" w:sz="1"/>
-            </w:tcBorders>
-            <w:shd w:fill="FFFFFF" w:val="clear"/>
-            <w:tcMar>
-              <w:top w:type="dxa" w:w="80"/>
-              <w:left w:type="dxa" w:w="120"/>
-              <w:bottom w:type="dxa" w:w="80"/>
-              <w:right w:type="dxa" w:w="120"/>
-            </w:tcMar>
-          </w:tcPr>
-          <w:p>
-            <w:r>
-              <w:rPr>
-                <w:rFonts w:ascii="Arial" w:cs="Arial" w:eastAsia="Arial" w:hAnsi="Arial"/>
-                <w:b w:val="false"/>
-                <w:bCs w:val="false"/>
-                <w:color w:val="1E293B"/>
-                <w:sz w:val="20"/>
-                <w:szCs w:val="20"/>
-              </w:rPr>
-              <w:t xml:space="preserve">Save all edits to localStorage so changes survive browser restarts without needing to export first.</w:t>
-            </w:r>
-          </w:p>
-        </w:tc>
-        <w:tc>
-          <w:tcPr>
-            <w:tcW w:type="dxa" w:w="2000"/>
-            <w:tcBorders>
-              <w:top w:val="single" w:color="E2E8F0" w:sz="1"/>
-              <w:left w:val="single" w:color="E2E8F0" w:sz="1"/>
-              <w:bottom w:val="single" w:color="E2E8F0" w:sz="1"/>
-              <w:right w:val="single" w:color="E2E8F0" w:sz="1"/>
-            </w:tcBorders>
-            <w:shd w:fill="CCFBF1" w:val="clear"/>
-            <w:tcMar>
-              <w:top w:type="dxa" w:w="80"/>
-              <w:left w:type="dxa" w:w="120"/>
-              <w:bottom w:type="dxa" w:w="80"/>
-              <w:right w:type="dxa" w:w="120"/>
-            </w:tcMar>
-          </w:tcPr>
-          <w:p>
-            <w:pPr>
-              <w:jc w:val="center"/>
-            </w:pPr>
-            <w:r>
-              <w:rPr>
-                <w:rFonts w:ascii="Arial" w:cs="Arial" w:eastAsia="Arial" w:hAnsi="Arial"/>
-                <w:b/>
-                <w:bCs/>
-                <w:color w:val="0D9488"/>
-                <w:sz w:val="18"/>
-                <w:szCs w:val="18"/>
-              </w:rPr>
-              <w:t xml:space="preserve">HIGH</w:t>
             </w:r>
           </w:p>
         </w:tc>
@@ -3688,7 +3609,7 @@
                 <w:sz w:val="20"/>
                 <w:szCs w:val="20"/>
               </w:rPr>
-              <w:t xml:space="preserve">Local Persistence</w:t>
+              <w:t xml:space="preserve">Import from Excel</w:t>
             </w:r>
           </w:p>
         </w:tc>
@@ -3717,7 +3638,7 @@
                 <w:sz w:val="20"/>
                 <w:szCs w:val="20"/>
               </w:rPr>
-              <w:t xml:space="preserve">Edits are currently lost on page close</w:t>
+              <w:t xml:space="preserve">Keeps the app in sync with the spreadsheet</w:t>
             </w:r>
           </w:p>
         </w:tc>
@@ -3850,7 +3771,7 @@
                 <w:sz w:val="20"/>
                 <w:szCs w:val="20"/>
               </w:rPr>
-              <w:t xml:space="preserve">Import from Excel</w:t>
+              <w:t xml:space="preserve">Ping / Reachability</w:t>
             </w:r>
           </w:p>
         </w:tc>
@@ -3879,7 +3800,7 @@
                 <w:sz w:val="20"/>
                 <w:szCs w:val="20"/>
               </w:rPr>
-              <w:t xml:space="preserve">Keeps the app in sync with the spreadsheet</w:t>
+              <w:t xml:space="preserve">Adds live operational awareness</w:t>
             </w:r>
           </w:p>
         </w:tc>
@@ -3911,7 +3832,7 @@
                 <w:sz w:val="20"/>
                 <w:szCs w:val="20"/>
               </w:rPr>
-              <w:t xml:space="preserve">Low</w:t>
+              <w:t xml:space="preserve">Med</w:t>
             </w:r>
           </w:p>
         </w:tc>
@@ -4012,7 +3933,7 @@
                 <w:sz w:val="20"/>
                 <w:szCs w:val="20"/>
               </w:rPr>
-              <w:t xml:space="preserve">Ping / Reachability</w:t>
+              <w:t xml:space="preserve">Proxmox Integration</w:t>
             </w:r>
           </w:p>
         </w:tc>
@@ -4041,7 +3962,7 @@
                 <w:sz w:val="20"/>
                 <w:szCs w:val="20"/>
               </w:rPr>
-              <w:t xml:space="preserve">Adds live operational awareness</w:t>
+              <w:t xml:space="preserve">Auto-discovery removes manual data entry</w:t>
             </w:r>
           </w:p>
         </w:tc>
@@ -4174,7 +4095,7 @@
                 <w:sz w:val="20"/>
                 <w:szCs w:val="20"/>
               </w:rPr>
-              <w:t xml:space="preserve">Proxmox Integration</w:t>
+              <w:t xml:space="preserve">Service Health Check</w:t>
             </w:r>
           </w:p>
         </w:tc>
@@ -4203,7 +4124,7 @@
                 <w:sz w:val="20"/>
                 <w:szCs w:val="20"/>
               </w:rPr>
-              <w:t xml:space="preserve">Auto-discovery removes manual data entry</w:t>
+              <w:t xml:space="preserve">Shows at a glance if key services are running</w:t>
             </w:r>
           </w:p>
         </w:tc>
@@ -4336,7 +4257,7 @@
                 <w:sz w:val="20"/>
                 <w:szCs w:val="20"/>
               </w:rPr>
-              <w:t xml:space="preserve">Service Health Check</w:t>
+              <w:t xml:space="preserve">Change History</w:t>
             </w:r>
           </w:p>
         </w:tc>
@@ -4365,7 +4286,7 @@
                 <w:sz w:val="20"/>
                 <w:szCs w:val="20"/>
               </w:rPr>
-              <w:t xml:space="preserve">Shows at a glance if key services are running</w:t>
+              <w:t xml:space="preserve">Audit trail for a managed network is essential</w:t>
             </w:r>
           </w:p>
         </w:tc>
@@ -4397,7 +4318,7 @@
                 <w:sz w:val="20"/>
                 <w:szCs w:val="20"/>
               </w:rPr>
-              <w:t xml:space="preserve">Med</w:t>
+              <w:t xml:space="preserve">Low</w:t>
             </w:r>
           </w:p>
         </w:tc>
@@ -4431,7 +4352,7 @@
                 <w:sz w:val="20"/>
                 <w:szCs w:val="20"/>
               </w:rPr>
-              <w:t xml:space="preserve">High</w:t>
+              <w:t xml:space="preserve">Med</w:t>
             </w:r>
           </w:p>
         </w:tc>
@@ -4498,7 +4419,7 @@
                 <w:sz w:val="20"/>
                 <w:szCs w:val="20"/>
               </w:rPr>
-              <w:t xml:space="preserve">Change History</w:t>
+              <w:t xml:space="preserve">Notes / Comments</w:t>
             </w:r>
           </w:p>
         </w:tc>
@@ -4527,7 +4448,7 @@
                 <w:sz w:val="20"/>
                 <w:szCs w:val="20"/>
               </w:rPr>
-              <w:t xml:space="preserve">Audit trail for a managed network is essential</w:t>
+              <w:t xml:space="preserve">Extra context per IP without cluttering the UI</w:t>
             </w:r>
           </w:p>
         </w:tc>

</xml_diff>

<commit_message>
Refactor initial IP data and import fields
Replace the large hardcoded IP dataset with a smaller, example-focused initialIpData (adds notes field and clearer comments). Update import modal to standardise the Proxmox/host column to a generic "host" key (label, synonyms, and parsing fallback updated), adjust the CSV template example, and use host for location fallback. Update README to document the Import button (CSV/XLSX support, mapping, Merge/Replace modes) and add Phase 1 roadmap items (Sort controls, Last modified date). Binary roadmap doc updated as well.
</commit_message>
<xml_diff>
--- a/IP_Manager_Roadmap.docx
+++ b/IP_Manager_Roadmap.docx
@@ -137,7 +137,7 @@
           <w:sz w:val="36"/>
           <w:szCs w:val="36"/>
         </w:rPr>
-        <w:t xml:space="preserve">Current State (v1.2)</w:t>
+        <w:t xml:space="preserve">Current State (v1.3)</w:t>
       </w:r>
     </w:p>
     <w:p>
@@ -232,7 +232,26 @@
           <w:sz w:val="22"/>
           <w:szCs w:val="22"/>
         </w:rPr>
-        <w:t xml:space="preserve">Edit modal for any IP entry — change name, hostname, type, location, and service</w:t>
+        <w:t xml:space="preserve">Edit modal for any IP entry — change name, hostname, type, location, service, and notes</w:t>
+      </w:r>
+    </w:p>
+    <w:p>
+      <w:pPr>
+        <w:pStyle w:val="ListParagraph"/>
+        <w:numPr>
+          <w:ilvl w:val="0"/>
+          <w:numId w:val="2"/>
+        </w:numPr>
+        <w:spacing w:after="40" w:before="40"/>
+      </w:pPr>
+      <w:r>
+        <w:rPr>
+          <w:rFonts w:ascii="Arial" w:cs="Arial" w:eastAsia="Arial" w:hAnsi="Arial"/>
+          <w:color w:val="1E293B"/>
+          <w:sz w:val="22"/>
+          <w:szCs w:val="22"/>
+        </w:rPr>
+        <w:t xml:space="preserve">Notes field per entry — visible in the edit modal and on expanded cards</w:t>
       </w:r>
     </w:p>
     <w:p>
@@ -289,7 +308,7 @@
           <w:sz w:val="22"/>
           <w:szCs w:val="22"/>
         </w:rPr>
-        <w:t xml:space="preserve">Download as Excel (.xlsx) using SheetJS — preserves all edits</w:t>
+        <w:t xml:space="preserve">Import from CSV / Excel — 3-step modal with column mapping, validation, and merge or replace modes</w:t>
       </w:r>
     </w:p>
     <w:p>
@@ -308,7 +327,7 @@
           <w:sz w:val="22"/>
           <w:szCs w:val="22"/>
         </w:rPr>
-        <w:t xml:space="preserve">SQLite backend — shared server-side database via Node/Express API; data is consistent across all users and browsers</w:t>
+        <w:t xml:space="preserve">Export to Excel (.xlsx) using SheetJS — preserves all edits</w:t>
       </w:r>
     </w:p>
     <w:p>
@@ -327,7 +346,26 @@
           <w:sz w:val="22"/>
           <w:szCs w:val="22"/>
         </w:rPr>
-        <w:t xml:space="preserve">Automatic API detection — app detects the server on startup and switches to SQLite mode; falls back to localStorage for local dev</w:t>
+        <w:t xml:space="preserve">SQLite backend — shared server-side database via Node/Express API; consistent across all users and browsers</w:t>
+      </w:r>
+    </w:p>
+    <w:p>
+      <w:pPr>
+        <w:pStyle w:val="ListParagraph"/>
+        <w:numPr>
+          <w:ilvl w:val="0"/>
+          <w:numId w:val="2"/>
+        </w:numPr>
+        <w:spacing w:after="40" w:before="40"/>
+      </w:pPr>
+      <w:r>
+        <w:rPr>
+          <w:rFonts w:ascii="Arial" w:cs="Arial" w:eastAsia="Arial" w:hAnsi="Arial"/>
+          <w:color w:val="1E293B"/>
+          <w:sz w:val="22"/>
+          <w:szCs w:val="22"/>
+        </w:rPr>
+        <w:t xml:space="preserve">Automatic API detection — falls back to localStorage for local dev when no server is present</w:t>
       </w:r>
     </w:p>
     <w:p>
@@ -384,7 +422,7 @@
           <w:sz w:val="22"/>
           <w:szCs w:val="22"/>
         </w:rPr>
-        <w:t xml:space="preserve">Deployed as a Vite + React project with a separate Express API server</w:t>
+        <w:t xml:space="preserve">Clean default dataset — ships with generic examples; users load their own data via Import</w:t>
       </w:r>
     </w:p>
     <w:p>
@@ -699,7 +737,7 @@
                 <w:sz w:val="20"/>
                 <w:szCs w:val="20"/>
               </w:rPr>
-              <w:t xml:space="preserve">Notes / Comments</w:t>
+              <w:t xml:space="preserve">Tag Support</w:t>
             </w:r>
           </w:p>
         </w:tc>
@@ -730,203 +768,7 @@
                 <w:sz w:val="20"/>
                 <w:szCs w:val="20"/>
               </w:rPr>
-              <w:t xml:space="preserve">Add a freetext notes field to each IP entry for extra context (e.g. credentials hint, purpose, last changed date). Surfaced in the edit modal and visible on expanded cards.</w:t>
-            </w:r>
-          </w:p>
-        </w:tc>
-        <w:tc>
-          <w:tcPr>
-            <w:tcW w:type="dxa" w:w="2000"/>
-            <w:tcBorders>
-              <w:top w:val="single" w:color="E2E8F0" w:sz="1"/>
-              <w:left w:val="single" w:color="E2E8F0" w:sz="1"/>
-              <w:bottom w:val="single" w:color="E2E8F0" w:sz="1"/>
-              <w:right w:val="single" w:color="E2E8F0" w:sz="1"/>
-            </w:tcBorders>
-            <w:shd w:fill="CCFBF1" w:val="clear"/>
-            <w:tcMar>
-              <w:top w:type="dxa" w:w="80"/>
-              <w:left w:type="dxa" w:w="120"/>
-              <w:bottom w:type="dxa" w:w="80"/>
-              <w:right w:type="dxa" w:w="120"/>
-            </w:tcMar>
-          </w:tcPr>
-          <w:p>
-            <w:pPr>
-              <w:jc w:val="center"/>
-            </w:pPr>
-            <w:r>
-              <w:rPr>
-                <w:rFonts w:ascii="Arial" w:cs="Arial" w:eastAsia="Arial" w:hAnsi="Arial"/>
-                <w:b/>
-                <w:bCs/>
-                <w:color w:val="0D9488"/>
-                <w:sz w:val="18"/>
-                <w:szCs w:val="18"/>
-              </w:rPr>
-              <w:t xml:space="preserve">HIGH</w:t>
-            </w:r>
-          </w:p>
-        </w:tc>
-      </w:tr>
-      <w:tr>
-        <w:tc>
-          <w:tcPr>
-            <w:tcW w:type="dxa" w:w="2800"/>
-            <w:tcBorders>
-              <w:top w:val="single" w:color="E2E8F0" w:sz="1"/>
-              <w:left w:val="single" w:color="E2E8F0" w:sz="1"/>
-              <w:bottom w:val="single" w:color="E2E8F0" w:sz="1"/>
-              <w:right w:val="single" w:color="E2E8F0" w:sz="1"/>
-            </w:tcBorders>
-            <w:shd w:fill="FFFFFF" w:val="clear"/>
-            <w:tcMar>
-              <w:top w:type="dxa" w:w="80"/>
-              <w:left w:type="dxa" w:w="120"/>
-              <w:bottom w:type="dxa" w:w="80"/>
-              <w:right w:type="dxa" w:w="120"/>
-            </w:tcMar>
-          </w:tcPr>
-          <w:p>
-            <w:r>
-              <w:rPr>
-                <w:rFonts w:ascii="Arial" w:cs="Arial" w:eastAsia="Arial" w:hAnsi="Arial"/>
-                <w:b/>
-                <w:bCs/>
-                <w:color w:val="1E293B"/>
-                <w:sz w:val="20"/>
-                <w:szCs w:val="20"/>
-              </w:rPr>
-              <w:t xml:space="preserve">Tag Support</w:t>
-            </w:r>
-          </w:p>
-        </w:tc>
-        <w:tc>
-          <w:tcPr>
-            <w:tcW w:type="dxa" w:w="4560"/>
-            <w:tcBorders>
-              <w:top w:val="single" w:color="E2E8F0" w:sz="1"/>
-              <w:left w:val="single" w:color="E2E8F0" w:sz="1"/>
-              <w:bottom w:val="single" w:color="E2E8F0" w:sz="1"/>
-              <w:right w:val="single" w:color="E2E8F0" w:sz="1"/>
-            </w:tcBorders>
-            <w:shd w:fill="FFFFFF" w:val="clear"/>
-            <w:tcMar>
-              <w:top w:type="dxa" w:w="80"/>
-              <w:left w:type="dxa" w:w="120"/>
-              <w:bottom w:type="dxa" w:w="80"/>
-              <w:right w:type="dxa" w:w="120"/>
-            </w:tcMar>
-          </w:tcPr>
-          <w:p>
-            <w:r>
-              <w:rPr>
-                <w:rFonts w:ascii="Arial" w:cs="Arial" w:eastAsia="Arial" w:hAnsi="Arial"/>
-                <w:b w:val="false"/>
-                <w:bCs w:val="false"/>
-                <w:color w:val="1E293B"/>
-                <w:sz w:val="20"/>
-                <w:szCs w:val="20"/>
-              </w:rPr>
               <w:t xml:space="preserve">Add custom tags to any entry (e.g. 'media', 'monitoring', 'IoT', 'cameras'). Tags are filterable in the header bar alongside Type and Location.</w:t>
-            </w:r>
-          </w:p>
-        </w:tc>
-        <w:tc>
-          <w:tcPr>
-            <w:tcW w:type="dxa" w:w="2000"/>
-            <w:tcBorders>
-              <w:top w:val="single" w:color="E2E8F0" w:sz="1"/>
-              <w:left w:val="single" w:color="E2E8F0" w:sz="1"/>
-              <w:bottom w:val="single" w:color="E2E8F0" w:sz="1"/>
-              <w:right w:val="single" w:color="E2E8F0" w:sz="1"/>
-            </w:tcBorders>
-            <w:shd w:fill="CCFBF1" w:val="clear"/>
-            <w:tcMar>
-              <w:top w:type="dxa" w:w="80"/>
-              <w:left w:type="dxa" w:w="120"/>
-              <w:bottom w:type="dxa" w:w="80"/>
-              <w:right w:type="dxa" w:w="120"/>
-            </w:tcMar>
-          </w:tcPr>
-          <w:p>
-            <w:pPr>
-              <w:jc w:val="center"/>
-            </w:pPr>
-            <w:r>
-              <w:rPr>
-                <w:rFonts w:ascii="Arial" w:cs="Arial" w:eastAsia="Arial" w:hAnsi="Arial"/>
-                <w:b/>
-                <w:bCs/>
-                <w:color w:val="0D9488"/>
-                <w:sz w:val="18"/>
-                <w:szCs w:val="18"/>
-              </w:rPr>
-              <w:t xml:space="preserve">HIGH</w:t>
-            </w:r>
-          </w:p>
-        </w:tc>
-      </w:tr>
-      <w:tr>
-        <w:tc>
-          <w:tcPr>
-            <w:tcW w:type="dxa" w:w="2800"/>
-            <w:tcBorders>
-              <w:top w:val="single" w:color="E2E8F0" w:sz="1"/>
-              <w:left w:val="single" w:color="E2E8F0" w:sz="1"/>
-              <w:bottom w:val="single" w:color="E2E8F0" w:sz="1"/>
-              <w:right w:val="single" w:color="E2E8F0" w:sz="1"/>
-            </w:tcBorders>
-            <w:shd w:fill="FFFFFF" w:val="clear"/>
-            <w:tcMar>
-              <w:top w:type="dxa" w:w="80"/>
-              <w:left w:type="dxa" w:w="120"/>
-              <w:bottom w:type="dxa" w:w="80"/>
-              <w:right w:type="dxa" w:w="120"/>
-            </w:tcMar>
-          </w:tcPr>
-          <w:p>
-            <w:r>
-              <w:rPr>
-                <w:rFonts w:ascii="Arial" w:cs="Arial" w:eastAsia="Arial" w:hAnsi="Arial"/>
-                <w:b/>
-                <w:bCs/>
-                <w:color w:val="1E293B"/>
-                <w:sz w:val="20"/>
-                <w:szCs w:val="20"/>
-              </w:rPr>
-              <w:t xml:space="preserve">Import from Excel</w:t>
-            </w:r>
-          </w:p>
-        </w:tc>
-        <w:tc>
-          <w:tcPr>
-            <w:tcW w:type="dxa" w:w="4560"/>
-            <w:tcBorders>
-              <w:top w:val="single" w:color="E2E8F0" w:sz="1"/>
-              <w:left w:val="single" w:color="E2E8F0" w:sz="1"/>
-              <w:bottom w:val="single" w:color="E2E8F0" w:sz="1"/>
-              <w:right w:val="single" w:color="E2E8F0" w:sz="1"/>
-            </w:tcBorders>
-            <w:shd w:fill="FFFFFF" w:val="clear"/>
-            <w:tcMar>
-              <w:top w:type="dxa" w:w="80"/>
-              <w:left w:type="dxa" w:w="120"/>
-              <w:bottom w:type="dxa" w:w="80"/>
-              <w:right w:type="dxa" w:w="120"/>
-            </w:tcMar>
-          </w:tcPr>
-          <w:p>
-            <w:r>
-              <w:rPr>
-                <w:rFonts w:ascii="Arial" w:cs="Arial" w:eastAsia="Arial" w:hAnsi="Arial"/>
-                <w:b w:val="false"/>
-                <w:bCs w:val="false"/>
-                <w:color w:val="1E293B"/>
-                <w:sz w:val="20"/>
-                <w:szCs w:val="20"/>
-              </w:rPr>
-              <w:t xml:space="preserve">Drag-and-drop an .xlsx file to reload the data set — so the app stays in sync with the spreadsheet as the source of truth.</w:t>
             </w:r>
           </w:p>
         </w:tc>
@@ -3707,7 +3549,7 @@
                 <w:sz w:val="20"/>
                 <w:szCs w:val="20"/>
               </w:rPr>
-              <w:t xml:space="preserve">Notes / Comments</w:t>
+              <w:t xml:space="preserve">Tag Support</w:t>
             </w:r>
           </w:p>
         </w:tc>
@@ -3736,7 +3578,7 @@
                 <w:sz w:val="20"/>
                 <w:szCs w:val="20"/>
               </w:rPr>
-              <w:t xml:space="preserve">Directly requested by users — low effort, immediately useful</w:t>
+              <w:t xml:space="preserve">Directly requested — richer filtering beyond type and location</w:t>
             </w:r>
           </w:p>
         </w:tc>
@@ -3869,7 +3711,7 @@
                 <w:sz w:val="20"/>
                 <w:szCs w:val="20"/>
               </w:rPr>
-              <w:t xml:space="preserve">Tag Support</w:t>
+              <w:t xml:space="preserve">Multiple IPs per Host</w:t>
             </w:r>
           </w:p>
         </w:tc>
@@ -3898,7 +3740,7 @@
                 <w:sz w:val="20"/>
                 <w:szCs w:val="20"/>
               </w:rPr>
-              <w:t xml:space="preserve">Directly requested — richer filtering beyond type and location</w:t>
+              <w:t xml:space="preserve">Prerequisite for VLANs; real-world need for multi-NIC servers</w:t>
             </w:r>
           </w:p>
         </w:tc>
@@ -3930,7 +3772,7 @@
                 <w:sz w:val="20"/>
                 <w:szCs w:val="20"/>
               </w:rPr>
-              <w:t xml:space="preserve">Low</w:t>
+              <w:t xml:space="preserve">Med</w:t>
             </w:r>
           </w:p>
         </w:tc>
@@ -4031,7 +3873,7 @@
                 <w:sz w:val="20"/>
                 <w:szCs w:val="20"/>
               </w:rPr>
-              <w:t xml:space="preserve">Multiple IPs per Host</w:t>
+              <w:t xml:space="preserve">VLAN &amp; Multi-Network</w:t>
             </w:r>
           </w:p>
         </w:tc>
@@ -4060,7 +3902,7 @@
                 <w:sz w:val="20"/>
                 <w:szCs w:val="20"/>
               </w:rPr>
-              <w:t xml:space="preserve">Prerequisite for VLANs; real-world need for multi-NIC servers</w:t>
+              <w:t xml:space="preserve">Directly requested — essential for a segmented home lab</w:t>
             </w:r>
           </w:p>
         </w:tc>
@@ -4193,7 +4035,7 @@
                 <w:sz w:val="20"/>
                 <w:szCs w:val="20"/>
               </w:rPr>
-              <w:t xml:space="preserve">VLAN &amp; Multi-Network</w:t>
+              <w:t xml:space="preserve">Ping / Reachability</w:t>
             </w:r>
           </w:p>
         </w:tc>
@@ -4222,7 +4064,7 @@
                 <w:sz w:val="20"/>
                 <w:szCs w:val="20"/>
               </w:rPr>
-              <w:t xml:space="preserve">Directly requested — essential for a segmented home lab</w:t>
+              <w:t xml:space="preserve">Adds live operational awareness with no new infrastructure</w:t>
             </w:r>
           </w:p>
         </w:tc>
@@ -4355,7 +4197,7 @@
                 <w:sz w:val="20"/>
                 <w:szCs w:val="20"/>
               </w:rPr>
-              <w:t xml:space="preserve">Import from Excel</w:t>
+              <w:t xml:space="preserve">Proxmox Integration</w:t>
             </w:r>
           </w:p>
         </w:tc>
@@ -4384,7 +4226,7 @@
                 <w:sz w:val="20"/>
                 <w:szCs w:val="20"/>
               </w:rPr>
-              <w:t xml:space="preserve">Keeps the app in sync with the spreadsheet</w:t>
+              <w:t xml:space="preserve">Auto-discovery removes manual data entry</w:t>
             </w:r>
           </w:p>
         </w:tc>
@@ -4416,7 +4258,7 @@
                 <w:sz w:val="20"/>
                 <w:szCs w:val="20"/>
               </w:rPr>
-              <w:t xml:space="preserve">Low</w:t>
+              <w:t xml:space="preserve">Med</w:t>
             </w:r>
           </w:p>
         </w:tc>
@@ -4517,7 +4359,7 @@
                 <w:sz w:val="20"/>
                 <w:szCs w:val="20"/>
               </w:rPr>
-              <w:t xml:space="preserve">Ping / Reachability</w:t>
+              <w:t xml:space="preserve">Service Health Check</w:t>
             </w:r>
           </w:p>
         </w:tc>
@@ -4546,7 +4388,7 @@
                 <w:sz w:val="20"/>
                 <w:szCs w:val="20"/>
               </w:rPr>
-              <w:t xml:space="preserve">Adds live operational awareness with no new infrastructure</w:t>
+              <w:t xml:space="preserve">Shows at a glance if key services are running</w:t>
             </w:r>
           </w:p>
         </w:tc>

</xml_diff>

<commit_message>
Update README and roadmap to reflect v1.6 features
- README: note /16 support, DHCP reservations anywhere, Clear All Data,
  subnet auto-normalisation, updated network config table and roadmap section
- Roadmap: bump version to v1.6, add four new Current State bullet points
  (/16 support, reservations anywhere, Clear All Data, subnet normalisation),
  update phase notes and priority summary to reference v1.4–v1.6

Co-Authored-By: Claude Sonnet 4.6 <noreply@anthropic.com>
</commit_message>
<xml_diff>
--- a/IP_Manager_Roadmap.docx
+++ b/IP_Manager_Roadmap.docx
@@ -96,7 +96,7 @@
           <w:sz w:val="22"/>
           <w:szCs w:val="22"/>
         </w:rPr>
-        <w:t xml:space="preserve">The IP Address Manager started as a static Excel spreadsheet used to track home network assignments across servers, containers, cameras, and networking equipment. It has evolved into a full-stack React web application (v1.5) with a SQLite backend, real-time search, tag filtering, sortable table view, editable entries, CSV/Excel import and export, and a built-in Settings panel — deployable as a shared tool on a home LXC. A native iPad app (SwiftUI, iOS 26) is in active development alongside the web app. Released under the PolyForm Noncommercial License.</w:t>
+        <w:t xml:space="preserve">The IP Address Manager started as a static Excel spreadsheet used to track home network assignments across servers, containers, cameras, and networking equipment. It has evolved into a full-stack React web application (v1.6) with a SQLite backend, real-time search, tag filtering, sortable table view, editable entries, CSV/Excel import and export, and a built-in Settings panel — deployable as a shared tool on a home LXC. A native iPad app (SwiftUI, iOS 26) is in active development alongside the web app. Released under the PolyForm Noncommercial License.</w:t>
       </w:r>
     </w:p>
     <w:p>
@@ -137,7 +137,7 @@
           <w:sz w:val="36"/>
           <w:szCs w:val="36"/>
         </w:rPr>
-        <w:t xml:space="preserve">Current State (v1.5)</w:t>
+        <w:t xml:space="preserve">Current State (v1.6)</w:t>
       </w:r>
     </w:p>
     <w:p>
@@ -518,6 +518,82 @@
           <w:szCs w:val="22"/>
         </w:rPr>
         <w:t xml:space="preserve">Source code managed on GitHub under the PolyForm Noncommercial License</w:t>
+      </w:r>
+    </w:p>
+    <w:p>
+      <w:pPr>
+        <w:pStyle w:val="ListParagraph"/>
+        <w:numPr>
+          <w:ilvl w:val="0"/>
+          <w:numId w:val="2"/>
+        </w:numPr>
+        <w:spacing w:after="40" w:before="40"/>
+      </w:pPr>
+      <w:r>
+        <w:rPr>
+          <w:rFonts w:ascii="Arial" w:cs="Arial" w:eastAsia="Arial" w:hAnsi="Arial"/>
+          <w:color w:val="1E293B"/>
+          <w:sz w:val="22"/>
+          <w:szCs w:val="22"/>
+        </w:rPr>
+        <w:t xml:space="preserve">/16 network support — both /24 (e.g. 192.168.1.x) and /16 (e.g. 172.16.x.x) subnet masks are fully supported; DHCP and static ranges accept two-octet host portions for /16 networks</w:t>
+      </w:r>
+    </w:p>
+    <w:p>
+      <w:pPr>
+        <w:pStyle w:val="ListParagraph"/>
+        <w:numPr>
+          <w:ilvl w:val="0"/>
+          <w:numId w:val="2"/>
+        </w:numPr>
+        <w:spacing w:after="40" w:before="40"/>
+      </w:pPr>
+      <w:r>
+        <w:rPr>
+          <w:rFonts w:ascii="Arial" w:cs="Arial" w:eastAsia="Arial" w:hAnsi="Arial"/>
+          <w:color w:val="1E293B"/>
+          <w:sz w:val="22"/>
+          <w:szCs w:val="22"/>
+        </w:rPr>
+        <w:t xml:space="preserve">DHCP reservations anywhere on the network — fixed DHCP assignments are no longer constrained to the DHCP pool range; reservations on any subnet (e.g. 172.16.0.x, 172.16.3.x alongside a pool at 172.16.2.x) are correctly classified and badged</w:t>
+      </w:r>
+    </w:p>
+    <w:p>
+      <w:pPr>
+        <w:pStyle w:val="ListParagraph"/>
+        <w:numPr>
+          <w:ilvl w:val="0"/>
+          <w:numId w:val="2"/>
+        </w:numPr>
+        <w:spacing w:after="40" w:before="40"/>
+      </w:pPr>
+      <w:r>
+        <w:rPr>
+          <w:rFonts w:ascii="Arial" w:cs="Arial" w:eastAsia="Arial" w:hAnsi="Arial"/>
+          <w:color w:val="1E293B"/>
+          <w:sz w:val="22"/>
+          <w:szCs w:val="22"/>
+        </w:rPr>
+        <w:t xml:space="preserve">Clear All Network Data — Danger Zone in Settings allows wiping all IP entries with a two-step confirmation; persists through the normal save path (SQLite or localStorage)</w:t>
+      </w:r>
+    </w:p>
+    <w:p>
+      <w:pPr>
+        <w:pStyle w:val="ListParagraph"/>
+        <w:numPr>
+          <w:ilvl w:val="0"/>
+          <w:numId w:val="2"/>
+        </w:numPr>
+        <w:spacing w:after="40" w:before="40"/>
+      </w:pPr>
+      <w:r>
+        <w:rPr>
+          <w:rFonts w:ascii="Arial" w:cs="Arial" w:eastAsia="Arial" w:hAnsi="Arial"/>
+          <w:color w:val="1E293B"/>
+          <w:sz w:val="22"/>
+          <w:szCs w:val="22"/>
+        </w:rPr>
+        <w:t xml:space="preserve">Subnet auto-normalisation — the subnet field accepts any format (192.168.1.0, 192.168.1, 172.16.0.0/16); trailing zero octets and CIDR suffixes are stripped automatically on save</w:t>
       </w:r>
     </w:p>
     <w:p>
@@ -646,7 +722,7 @@
           <w:sz w:val="22"/>
           <w:szCs w:val="22"/>
         </w:rPr>
-        <w:t xml:space="preserve">Tags, Sort Controls, Last Modified Date, and Keyboard Shortcuts all shipped in v1.4/v1.5. The only remaining Phase 1 item is PWA/Offline Support.</w:t>
+        <w:t xml:space="preserve">Tags, Sort Controls, Last Modified Date, and Keyboard Shortcuts all shipped in v1.4–v1.6. The only remaining Phase 1 item is PWA/Offline Support.</w:t>
       </w:r>
     </w:p>
     <w:p>
@@ -3392,7 +3468,7 @@
           <w:sz w:val="22"/>
           <w:szCs w:val="22"/>
         </w:rPr>
-        <w:t xml:space="preserve">Tags, Sort Controls, Last Modified Date, and Keyboard Shortcuts have all shipped. The iPad native app is in active development. The table below ranks the top remaining web app items by effort vs. impact.</w:t>
+        <w:t xml:space="preserve">Tags, Sort Controls, Last Modified Date, Keyboard Shortcuts, /16 network support, DHCP reservations anywhere on the network, Clear All Data, and subnet auto-normalisation have all shipped (v1.4–v1.6). The iPad native app is in active development. The table below ranks the top remaining web app items by effort vs. impact.</w:t>
       </w:r>
     </w:p>
     <w:p>

</xml_diff>

<commit_message>
Update README and roadmap to v1.7
README:
- Added v1.7 Features section (bulk selection/edit, location management,
  free IPs in main list)
- Added Locations row to Network Configuration table
- Updated Phase 1 roadmap summary to mark v1.7 items as shipped

Roadmap:
- Bumped version to v1.7 throughout
- Added three new Current State bullets (bulk operations, location
  management, free IPs in main list)
- Marked Bulk Operations in Phase 2 table as shipped v1.7
- Updated Priority Summary to list all v1.4–v1.7 shipped items

Co-Authored-By: Claude Sonnet 4.6 <noreply@anthropic.com>
</commit_message>
<xml_diff>
--- a/IP_Manager_Roadmap.docx
+++ b/IP_Manager_Roadmap.docx
@@ -96,7 +96,7 @@
           <w:sz w:val="22"/>
           <w:szCs w:val="22"/>
         </w:rPr>
-        <w:t xml:space="preserve">The IP Address Manager started as a static Excel spreadsheet used to track home network assignments across servers, containers, cameras, and networking equipment. It has evolved into a full-stack React web application (v1.6) with a SQLite backend, real-time search, tag filtering, sortable table view, editable entries, CSV/Excel import and export, and a built-in Settings panel — deployable as a shared tool on a home LXC. A native iPad app (SwiftUI, iOS 26) is in active development alongside the web app. Released under the PolyForm Noncommercial License.</w:t>
+        <w:t xml:space="preserve">The IP Address Manager started as a static Excel spreadsheet used to track home network assignments across servers, containers, cameras, and networking equipment. It has evolved into a full-stack React web application (v1.7) with a SQLite backend, real-time search, tag filtering, sortable table view, editable entries, CSV/Excel import and export, and a built-in Settings panel — deployable as a shared tool on a home LXC. A native iPad app (SwiftUI, iOS 26) is in active development alongside the web app. Released under the PolyForm Noncommercial License.</w:t>
       </w:r>
     </w:p>
     <w:p>
@@ -137,7 +137,7 @@
           <w:sz w:val="36"/>
           <w:szCs w:val="36"/>
         </w:rPr>
-        <w:t xml:space="preserve">Current State (v1.6)</w:t>
+        <w:t xml:space="preserve">Current State (v1.7)</w:t>
       </w:r>
     </w:p>
     <w:p>
@@ -594,6 +594,63 @@
           <w:szCs w:val="22"/>
         </w:rPr>
         <w:t xml:space="preserve">Subnet auto-normalisation — the subnet field accepts any format (192.168.1.0, 192.168.1, 172.16.0.0/16); trailing zero octets and CIDR suffixes are stripped automatically on save</w:t>
+      </w:r>
+    </w:p>
+    <w:p>
+      <w:pPr>
+        <w:pStyle w:val="ListParagraph"/>
+        <w:numPr>
+          <w:ilvl w:val="0"/>
+          <w:numId w:val="2"/>
+        </w:numPr>
+        <w:spacing w:after="40" w:before="40"/>
+      </w:pPr>
+      <w:r>
+        <w:rPr>
+          <w:rFonts w:ascii="Arial" w:cs="Arial" w:eastAsia="Arial" w:hAnsi="Arial"/>
+          <w:color w:val="1E293B"/>
+          <w:sz w:val="22"/>
+          <w:szCs w:val="22"/>
+        </w:rPr>
+        <w:t xml:space="preserve">Bulk selection and bulk edit — checkboxes on every card and table row; selecting items reveals a bulk action bar; the Bulk Edit modal appends tags, overwrites type, or overwrites location across all selected entries at once; a Release button returns all selected IPs to the free pool in one action</w:t>
+      </w:r>
+    </w:p>
+    <w:p>
+      <w:pPr>
+        <w:pStyle w:val="ListParagraph"/>
+        <w:numPr>
+          <w:ilvl w:val="0"/>
+          <w:numId w:val="2"/>
+        </w:numPr>
+        <w:spacing w:after="40" w:before="40"/>
+      </w:pPr>
+      <w:r>
+        <w:rPr>
+          <w:rFonts w:ascii="Arial" w:cs="Arial" w:eastAsia="Arial" w:hAnsi="Arial"/>
+          <w:color w:val="1E293B"/>
+          <w:sz w:val="22"/>
+          <w:szCs w:val="22"/>
+        </w:rPr>
+        <w:t xml:space="preserve">Location management — new Locations section in Settings: rename a location across every entry at once, delete a location (clears it from all entries), or add new locations before any entry uses them</w:t>
+      </w:r>
+    </w:p>
+    <w:p>
+      <w:pPr>
+        <w:pStyle w:val="ListParagraph"/>
+        <w:numPr>
+          <w:ilvl w:val="0"/>
+          <w:numId w:val="2"/>
+        </w:numPr>
+        <w:spacing w:after="40" w:before="40"/>
+      </w:pPr>
+      <w:r>
+        <w:rPr>
+          <w:rFonts w:ascii="Arial" w:cs="Arial" w:eastAsia="Arial" w:hAnsi="Arial"/>
+          <w:color w:val="1E293B"/>
+          <w:sz w:val="22"/>
+          <w:szCs w:val="22"/>
+        </w:rPr>
+        <w:t xml:space="preserve">Free IPs in main list — free static IPs are computed from the static range minus assigned entries and appear as searchable Available cards and rows in the main view; clicking one opens the claim dialog directly</w:t>
       </w:r>
     </w:p>
     <w:p>
@@ -722,7 +779,7 @@
           <w:sz w:val="22"/>
           <w:szCs w:val="22"/>
         </w:rPr>
-        <w:t xml:space="preserve">Tags, Sort Controls, Last Modified Date, and Keyboard Shortcuts all shipped in v1.4–v1.6. The only remaining Phase 1 item is PWA/Offline Support.</w:t>
+        <w:t xml:space="preserve">Tags, Sort Controls, Last Modified Date, and Keyboard Shortcuts all shipped in v1.4–v1.7. The only remaining Phase 1 item is PWA/Offline Support.</w:t>
       </w:r>
     </w:p>
     <w:p>
@@ -1803,7 +1860,7 @@
                 <w:sz w:val="20"/>
                 <w:szCs w:val="20"/>
               </w:rPr>
-              <w:t xml:space="preserve">Bulk Operations</w:t>
+              <w:t xml:space="preserve">Bulk Operations ✅ Shipped v1.7</w:t>
             </w:r>
           </w:p>
         </w:tc>
@@ -3468,7 +3525,7 @@
           <w:sz w:val="22"/>
           <w:szCs w:val="22"/>
         </w:rPr>
-        <w:t xml:space="preserve">Tags, Sort Controls, Last Modified Date, Keyboard Shortcuts, /16 network support, DHCP reservations anywhere on the network, Clear All Data, and subnet auto-normalisation have all shipped (v1.4–v1.6). The iPad native app is in active development. The table below ranks the top remaining web app items by effort vs. impact.</w:t>
+        <w:t xml:space="preserve">Tags, Sort Controls, Last Modified Date, Keyboard Shortcuts, /16 network support, DHCP reservations anywhere, Clear All Data, subnet auto-normalisation, bulk selection and bulk edit, location management, and free IPs in the main list have all shipped (v1.4–v1.7). The iPad native app is in active development. The table below ranks the top remaining web app items by effort vs. impact.</w:t>
       </w:r>
     </w:p>
     <w:p>

</xml_diff>

<commit_message>
feat: first-time hint on login screen + docs update to v1.9
Login screen: adds a small info box below the sign-in form:
  "First time? Sign in with admin / admin, then go to Settings → Account
  to set your own credentials."

README: version bump to v1.9, new v1.9 Features section describing auth,
Phase 1 roadmap marks login as shipped, Phase 3 multi-user auth clarified,
Settings table gains Account row, project structure gains credentials.env.

Roadmap docx: version bump to v1.9 throughout, new Current State bullet
for login/auth, Phase 1 summary updated, Priority Summary updated,
Multi-User/Auth table row notes single-user login shipped and multi-user
remaining for Phase 3.

Co-Authored-By: Claude Sonnet 4.6 <noreply@anthropic.com>
</commit_message>
<xml_diff>
--- a/IP_Manager_Roadmap.docx
+++ b/IP_Manager_Roadmap.docx
@@ -96,7 +96,7 @@
           <w:sz w:val="22"/>
           <w:szCs w:val="22"/>
         </w:rPr>
-        <w:t xml:space="preserve">The IP Address Manager started as a static Excel spreadsheet used to track home network assignments across servers, containers, cameras, and networking equipment. It has evolved into a full-stack React web application (v1.8) with a SQLite backend, real-time search, tag filtering, sortable table view, editable entries, CSV/Excel import and export, multi-network / VLAN support, full backup and restore, and a built-in Settings panel — deployable as a shared tool on a home LXC. A native iPad app (SwiftUI, iOS 26) is in active development alongside the web app. Released under the PolyForm Noncommercial License.</w:t>
+        <w:t xml:space="preserve">The IP Address Manager started as a static Excel spreadsheet used to track home network assignments across servers, containers, cameras, and networking equipment. It has evolved into a full-stack React web application (v1.9) with a SQLite backend, real-time search, tag filtering, sortable table view, editable entries, CSV/Excel import and export, multi-network / VLAN support, full backup and restore, login authentication, and a built-in Settings panel — deployable as a shared tool on a home LXC. A native iPad app (SwiftUI, iOS 26) is in active development alongside the web app. Released under the PolyForm Noncommercial License.</w:t>
       </w:r>
     </w:p>
     <w:p>
@@ -137,7 +137,7 @@
           <w:sz w:val="36"/>
           <w:szCs w:val="36"/>
         </w:rPr>
-        <w:t xml:space="preserve">Current State (v1.8)</w:t>
+        <w:t xml:space="preserve">Current State (v1.9)</w:t>
       </w:r>
     </w:p>
     <w:p>
@@ -708,6 +708,25 @@
           <w:szCs w:val="22"/>
         </w:rPr>
         <w:t xml:space="preserve">Full backup and restore — Settings → Backup &amp; Restore: download a .json file containing all networks, all IP entries, tags, notes, and change history; restore from any prior backup with a confirmation preview; hide-free-IPs display toggle for large /16 subnets</w:t>
+      </w:r>
+    </w:p>
+    <w:p>
+      <w:pPr>
+        <w:pStyle w:val="ListParagraph"/>
+        <w:numPr>
+          <w:ilvl w:val="0"/>
+          <w:numId w:val="2"/>
+        </w:numPr>
+        <w:spacing w:after="40" w:before="40"/>
+      </w:pPr>
+      <w:r>
+        <w:rPr>
+          <w:rFonts w:ascii="Arial" w:cs="Arial" w:eastAsia="Arial" w:hAnsi="Arial"/>
+          <w:color w:val="1E293B"/>
+          <w:sz w:val="22"/>
+          <w:szCs w:val="22"/>
+        </w:rPr>
+        <w:t xml:space="preserve">Login / authentication (v1.9) — username &amp; password login screen protects the app for shared/subdomain use; session cookie persists for the browser session; credentials managed via Settings → Account (no server access needed); default admin/admin with first-time hint on the login page; multi-user support planned for Phase 3</w:t>
       </w:r>
     </w:p>
     <w:p>
@@ -836,7 +855,7 @@
           <w:sz w:val="22"/>
           <w:szCs w:val="22"/>
         </w:rPr>
-        <w:t xml:space="preserve">Tags, Sort Controls, Last Modified Date, Keyboard Shortcuts, Bulk Operations, Location Management, Free IPs in main list, Change History, Multi-Network/VLAN support, Backup &amp; Restore, and Hide-Free-IPs toggle all shipped in v1.4–v1.8. The only remaining Phase 1 item is PWA/Offline Support.</w:t>
+        <w:t xml:space="preserve">Tags, Sort Controls, Last Modified Date, Keyboard Shortcuts, Bulk Operations, Location Management, Free IPs in main list, Change History, Multi-Network/VLAN support, Backup &amp; Restore, Hide-Free-IPs toggle, and Login Authentication all shipped in v1.4–v1.9. The only remaining Phase 1 item is PWA/Offline Support.</w:t>
       </w:r>
     </w:p>
     <w:p>
@@ -3274,7 +3293,7 @@
                 <w:sz w:val="20"/>
                 <w:szCs w:val="20"/>
               </w:rPr>
-              <w:t xml:space="preserve">Multi-User / Auth</w:t>
+              <w:t xml:space="preserve">Multi-User / Auth ✅ Login shipped v1.9</w:t>
             </w:r>
           </w:p>
         </w:tc>
@@ -3305,7 +3324,7 @@
                 <w:sz w:val="20"/>
                 <w:szCs w:val="20"/>
               </w:rPr>
-              <w:t xml:space="preserve">Simple login so the tool can be exposed on a subdomain (e.g. ipmanager.the-allens.uk) without being publicly writable.</w:t>
+              <w:t xml:space="preserve">Single-user login shipped in v1.9 (username/password, session cookie, change credentials in Settings). Remaining: multi-user accounts with role-based access (read-only vs. admin) for shared household use.</w:t>
             </w:r>
           </w:p>
         </w:tc>
@@ -3582,7 +3601,7 @@
           <w:sz w:val="22"/>
           <w:szCs w:val="22"/>
         </w:rPr>
-        <w:t xml:space="preserve">Tags, Sort Controls, Last Modified Date, Keyboard Shortcuts, /16 support, DHCP reservations anywhere, Clear All Data, subnet auto-normalisation, bulk selection and bulk edit, location management, free IPs in the main list, change history / audit log, multi-network / VLAN support, full backup and restore, and hide-free-IPs toggle have all shipped (v1.4–v1.8). The iPad native app is in active development. The table below ranks the top remaining web app items by effort vs. impact.</w:t>
+        <w:t xml:space="preserve">Tags, Sort Controls, Last Modified Date, Keyboard Shortcuts, /16 support, DHCP reservations anywhere, Clear All Data, subnet auto-normalisation, bulk selection and bulk edit, location management, free IPs in the main list, change history / audit log, multi-network / VLAN support, full backup and restore, hide-free-IPs toggle, and login authentication have all shipped (v1.4–v1.9). The iPad native app is in active development. The table below ranks the top remaining web app items by effort vs. impact.</w:t>
       </w:r>
     </w:p>
     <w:p>

</xml_diff>

<commit_message>
feat: Proxmox one-shot import (v1.10)
Adds a Proxmox button to the header (API/SQLite mode only) that opens a
two-step import modal. Step 1: enter the Proxmox host, API token, and an
optional "ignore TLS" flag. Step 2: preview discovered VMs and LXCs in a
table, select which to import, and choose merge or replace mode.

Server-side: a new POST /api/proxmox/discover endpoint proxies the
Proxmox REST API (avoids browser CORS/TLS issues), discovers all nodes,
LXCs (via /interfaces), and QEMU VMs (via guest agent), then returns
structured IP entries ready for import.

Roadmap updated: Phase 2 adds Proxmox scheduled sync, Phase 3 adds live
VM/LXC power-state badges. Both items added to the roadmap docx and
Priority Summary table.

Co-Authored-By: Claude Sonnet 4.6 <noreply@anthropic.com>
</commit_message>
<xml_diff>
--- a/IP_Manager_Roadmap.docx
+++ b/IP_Manager_Roadmap.docx
@@ -855,7 +855,7 @@
           <w:sz w:val="22"/>
           <w:szCs w:val="22"/>
         </w:rPr>
-        <w:t xml:space="preserve">Tags, Sort Controls, Last Modified Date, Keyboard Shortcuts, Bulk Operations, Location Management, Free IPs in main list, Change History, Multi-Network/VLAN support, Backup &amp; Restore, Hide-Free-IPs toggle, and Login Authentication all shipped in v1.4–v1.9. The only remaining Phase 1 item is PWA/Offline Support.</w:t>
+        <w:t xml:space="preserve">Tags, Sort Controls, Last Modified Date, Keyboard Shortcuts, Bulk Operations, Location Management, Free IPs in main list, Change History, Multi-Network/VLAN support, Backup &amp; Restore, Hide-Free-IPs toggle, Login Authentication (v1.9), and Proxmox one-shot import (v1.10) all shipped in v1.4–v1.10. The only remaining Phase 1 item is PWA/Offline Support.</w:t>
       </w:r>
     </w:p>
     <w:p>
@@ -1642,7 +1642,7 @@
                 <w:sz w:val="20"/>
                 <w:szCs w:val="20"/>
               </w:rPr>
-              <w:t xml:space="preserve">Proxmox Integration</w:t>
+              <w:t xml:space="preserve">Proxmox Scheduled Sync ✅ Phase 1 shipped v1.10</w:t>
             </w:r>
           </w:p>
         </w:tc>
@@ -1673,7 +1673,7 @@
                 <w:sz w:val="20"/>
                 <w:szCs w:val="20"/>
               </w:rPr>
-              <w:t xml:space="preserve">Read the Proxmox API to auto-discover VMs and LXCs with their IPs, auto-populating or flagging mismatches.</w:t>
+              <w:t xml:space="preserve">Phase 1 (one-shot import) shipped in v1.10 — click the Proxmox button to discover all VMs and LXCs and import them instantly. Phase 2 adds a scheduled sync that automatically re-discovers and updates Proxmox entries on a configurable interval.</w:t>
             </w:r>
           </w:p>
         </w:tc>
@@ -3555,6 +3555,104 @@
                 <w:szCs w:val="18"/>
               </w:rPr>
               <w:t xml:space="preserve">MED</w:t>
+            </w:r>
+          </w:p>
+        </w:tc>
+      </w:tr>
+      <w:tr>
+        <w:tc>
+          <w:tcPr>
+            <w:tcW w:type="dxa" w:w="2800"/>
+            <w:tcBorders>
+              <w:top w:val="single" w:color="E2E8F0" w:sz="1"/>
+              <w:left w:val="single" w:color="E2E8F0" w:sz="1"/>
+              <w:bottom w:val="single" w:color="E2E8F0" w:sz="1"/>
+              <w:right w:val="single" w:color="E2E8F0" w:sz="1"/>
+            </w:tcBorders>
+            <w:shd w:fill="FFFFFF" w:val="clear"/>
+            <w:tcMar>
+              <w:top w:type="dxa" w:w="80"/>
+              <w:left w:type="dxa" w:w="120"/>
+              <w:bottom w:type="dxa" w:w="80"/>
+              <w:right w:type="dxa" w:w="120"/>
+            </w:tcMar>
+          </w:tcPr>
+          <w:p>
+            <w:r>
+              <w:rPr>
+                <w:rFonts w:ascii="Arial" w:cs="Arial" w:eastAsia="Arial" w:hAnsi="Arial"/>
+                <w:b/>
+                <w:bCs/>
+                <w:color w:val="1E293B"/>
+                <w:sz w:val="20"/>
+                <w:szCs w:val="20"/>
+              </w:rPr>
+              <w:t xml:space="preserve">Proxmox Live Status</w:t>
+            </w:r>
+          </w:p>
+        </w:tc>
+        <w:tc>
+          <w:tcPr>
+            <w:tcW w:type="dxa" w:w="4560"/>
+            <w:tcBorders>
+              <w:top w:val="single" w:color="E2E8F0" w:sz="1"/>
+              <w:left w:val="single" w:color="E2E8F0" w:sz="1"/>
+              <w:bottom w:val="single" w:color="E2E8F0" w:sz="1"/>
+              <w:right w:val="single" w:color="E2E8F0" w:sz="1"/>
+            </w:tcBorders>
+            <w:shd w:fill="FFFFFF" w:val="clear"/>
+            <w:tcMar>
+              <w:top w:type="dxa" w:w="80"/>
+              <w:left w:type="dxa" w:w="120"/>
+              <w:bottom w:type="dxa" w:w="80"/>
+              <w:right w:type="dxa" w:w="120"/>
+            </w:tcMar>
+          </w:tcPr>
+          <w:p>
+            <w:r>
+              <w:rPr>
+                <w:rFonts w:ascii="Arial" w:cs="Arial" w:eastAsia="Arial" w:hAnsi="Arial"/>
+                <w:b w:val="false"/>
+                <w:bCs w:val="false"/>
+                <w:color w:val="1E293B"/>
+                <w:sz w:val="20"/>
+                <w:szCs w:val="20"/>
+              </w:rPr>
+              <w:t xml:space="preserve">Real-time VM and LXC power-state badges (running / stopped / paused) sourced from the Proxmox API — displayed directly on each IP card without needing to open the Proxmox UI.</w:t>
+            </w:r>
+          </w:p>
+        </w:tc>
+        <w:tc>
+          <w:tcPr>
+            <w:tcW w:type="dxa" w:w="2000"/>
+            <w:tcBorders>
+              <w:top w:val="single" w:color="E2E8F0" w:sz="1"/>
+              <w:left w:val="single" w:color="E2E8F0" w:sz="1"/>
+              <w:bottom w:val="single" w:color="E2E8F0" w:sz="1"/>
+              <w:right w:val="single" w:color="E2E8F0" w:sz="1"/>
+            </w:tcBorders>
+            <w:shd w:fill="CCFBF1" w:val="clear"/>
+            <w:tcMar>
+              <w:top w:type="dxa" w:w="80"/>
+              <w:left w:type="dxa" w:w="120"/>
+              <w:bottom w:type="dxa" w:w="80"/>
+              <w:right w:type="dxa" w:w="120"/>
+            </w:tcMar>
+          </w:tcPr>
+          <w:p>
+            <w:pPr>
+              <w:jc w:val="center"/>
+            </w:pPr>
+            <w:r>
+              <w:rPr>
+                <w:rFonts w:ascii="Arial" w:cs="Arial" w:eastAsia="Arial" w:hAnsi="Arial"/>
+                <w:b/>
+                <w:bCs/>
+                <w:color w:val="0D9488"/>
+                <w:sz w:val="18"/>
+                <w:szCs w:val="18"/>
+              </w:rPr>
+              <w:t xml:space="preserve">HIGH</w:t>
             </w:r>
           </w:p>
         </w:tc>
@@ -4719,6 +4817,330 @@
                 <w:szCs w:val="20"/>
               </w:rPr>
               <w:t xml:space="preserve">Med</w:t>
+            </w:r>
+          </w:p>
+        </w:tc>
+        <w:tc>
+          <w:tcPr>
+            <w:tcW w:type="dxa" w:w="1400"/>
+            <w:tcBorders>
+              <w:top w:val="single" w:color="E2E8F0" w:sz="1"/>
+              <w:left w:val="single" w:color="E2E8F0" w:sz="1"/>
+              <w:bottom w:val="single" w:color="E2E8F0" w:sz="1"/>
+              <w:right w:val="single" w:color="E2E8F0" w:sz="1"/>
+            </w:tcBorders>
+            <w:shd w:fill="FFFFFF" w:val="clear"/>
+            <w:tcMar>
+              <w:top w:type="dxa" w:w="80"/>
+              <w:left w:type="dxa" w:w="120"/>
+              <w:bottom w:type="dxa" w:w="80"/>
+              <w:right w:type="dxa" w:w="120"/>
+            </w:tcMar>
+          </w:tcPr>
+          <w:p>
+            <w:pPr>
+              <w:jc w:val="center"/>
+            </w:pPr>
+            <w:r>
+              <w:rPr>
+                <w:rFonts w:ascii="Arial" w:cs="Arial" w:eastAsia="Arial" w:hAnsi="Arial"/>
+                <w:b/>
+                <w:bCs/>
+                <w:color w:val="0D9488"/>
+                <w:sz w:val="20"/>
+                <w:szCs w:val="20"/>
+              </w:rPr>
+              <w:t xml:space="preserve">High</w:t>
+            </w:r>
+          </w:p>
+        </w:tc>
+      </w:tr>
+      <w:tr>
+        <w:tc>
+          <w:tcPr>
+            <w:tcW w:type="dxa" w:w="480"/>
+            <w:tcBorders>
+              <w:top w:val="single" w:color="E2E8F0" w:sz="1"/>
+              <w:left w:val="single" w:color="E2E8F0" w:sz="1"/>
+              <w:bottom w:val="single" w:color="E2E8F0" w:sz="1"/>
+              <w:right w:val="single" w:color="E2E8F0" w:sz="1"/>
+            </w:tcBorders>
+            <w:shd w:fill="FFFFFF" w:val="clear"/>
+            <w:tcMar>
+              <w:top w:type="dxa" w:w="80"/>
+              <w:left w:type="dxa" w:w="120"/>
+              <w:bottom w:type="dxa" w:w="80"/>
+              <w:right w:type="dxa" w:w="120"/>
+            </w:tcMar>
+          </w:tcPr>
+          <w:p>
+            <w:pPr>
+              <w:jc w:val="center"/>
+            </w:pPr>
+            <w:r>
+              <w:rPr>
+                <w:rFonts w:ascii="Arial" w:cs="Arial" w:eastAsia="Arial" w:hAnsi="Arial"/>
+                <w:b/>
+                <w:bCs/>
+                <w:color w:val="0D9488"/>
+                <w:sz w:val="20"/>
+                <w:szCs w:val="20"/>
+              </w:rPr>
+              <w:t xml:space="preserve">7</w:t>
+            </w:r>
+          </w:p>
+        </w:tc>
+        <w:tc>
+          <w:tcPr>
+            <w:tcW w:type="dxa" w:w="3200"/>
+            <w:tcBorders>
+              <w:top w:val="single" w:color="E2E8F0" w:sz="1"/>
+              <w:left w:val="single" w:color="E2E8F0" w:sz="1"/>
+              <w:bottom w:val="single" w:color="E2E8F0" w:sz="1"/>
+              <w:right w:val="single" w:color="E2E8F0" w:sz="1"/>
+            </w:tcBorders>
+            <w:shd w:fill="FFFFFF" w:val="clear"/>
+            <w:tcMar>
+              <w:top w:type="dxa" w:w="80"/>
+              <w:left w:type="dxa" w:w="120"/>
+              <w:bottom w:type="dxa" w:w="80"/>
+              <w:right w:type="dxa" w:w="120"/>
+            </w:tcMar>
+          </w:tcPr>
+          <w:p>
+            <w:r>
+              <w:rPr>
+                <w:rFonts w:ascii="Arial" w:cs="Arial" w:eastAsia="Arial" w:hAnsi="Arial"/>
+                <w:b/>
+                <w:bCs/>
+                <w:color w:val="1E293B"/>
+                <w:sz w:val="20"/>
+                <w:szCs w:val="20"/>
+              </w:rPr>
+              <w:t xml:space="preserve">Proxmox Scheduled Sync</w:t>
+            </w:r>
+          </w:p>
+        </w:tc>
+        <w:tc>
+          <w:tcPr>
+            <w:tcW w:type="dxa" w:w="2880"/>
+            <w:tcBorders>
+              <w:top w:val="single" w:color="E2E8F0" w:sz="1"/>
+              <w:left w:val="single" w:color="E2E8F0" w:sz="1"/>
+              <w:bottom w:val="single" w:color="E2E8F0" w:sz="1"/>
+              <w:right w:val="single" w:color="E2E8F0" w:sz="1"/>
+            </w:tcBorders>
+            <w:shd w:fill="FFFFFF" w:val="clear"/>
+            <w:tcMar>
+              <w:top w:type="dxa" w:w="80"/>
+              <w:left w:type="dxa" w:w="120"/>
+              <w:bottom w:type="dxa" w:w="80"/>
+              <w:right w:type="dxa" w:w="120"/>
+            </w:tcMar>
+          </w:tcPr>
+          <w:p>
+            <w:r>
+              <w:rPr>
+                <w:rFonts w:ascii="Arial" w:cs="Arial" w:eastAsia="Arial" w:hAnsi="Arial"/>
+                <w:color w:val="64748B"/>
+                <w:sz w:val="20"/>
+                <w:szCs w:val="20"/>
+              </w:rPr>
+              <w:t xml:space="preserve">Keeps Proxmox entries current without manual re-import</w:t>
+            </w:r>
+          </w:p>
+        </w:tc>
+        <w:tc>
+          <w:tcPr>
+            <w:tcW w:type="dxa" w:w="1400"/>
+            <w:tcBorders>
+              <w:top w:val="single" w:color="E2E8F0" w:sz="1"/>
+              <w:left w:val="single" w:color="E2E8F0" w:sz="1"/>
+              <w:bottom w:val="single" w:color="E2E8F0" w:sz="1"/>
+              <w:right w:val="single" w:color="E2E8F0" w:sz="1"/>
+            </w:tcBorders>
+            <w:shd w:fill="FFFFFF" w:val="clear"/>
+            <w:tcMar>
+              <w:top w:type="dxa" w:w="80"/>
+              <w:left w:type="dxa" w:w="120"/>
+              <w:bottom w:type="dxa" w:w="80"/>
+              <w:right w:type="dxa" w:w="120"/>
+            </w:tcMar>
+          </w:tcPr>
+          <w:p>
+            <w:pPr>
+              <w:jc w:val="center"/>
+            </w:pPr>
+            <w:r>
+              <w:rPr>
+                <w:rFonts w:ascii="Arial" w:cs="Arial" w:eastAsia="Arial" w:hAnsi="Arial"/>
+                <w:color w:val="1E293B"/>
+                <w:sz w:val="20"/>
+                <w:szCs w:val="20"/>
+              </w:rPr>
+              <w:t xml:space="preserve">Med</w:t>
+            </w:r>
+          </w:p>
+        </w:tc>
+        <w:tc>
+          <w:tcPr>
+            <w:tcW w:type="dxa" w:w="1400"/>
+            <w:tcBorders>
+              <w:top w:val="single" w:color="E2E8F0" w:sz="1"/>
+              <w:left w:val="single" w:color="E2E8F0" w:sz="1"/>
+              <w:bottom w:val="single" w:color="E2E8F0" w:sz="1"/>
+              <w:right w:val="single" w:color="E2E8F0" w:sz="1"/>
+            </w:tcBorders>
+            <w:shd w:fill="FFFFFF" w:val="clear"/>
+            <w:tcMar>
+              <w:top w:type="dxa" w:w="80"/>
+              <w:left w:type="dxa" w:w="120"/>
+              <w:bottom w:type="dxa" w:w="80"/>
+              <w:right w:type="dxa" w:w="120"/>
+            </w:tcMar>
+          </w:tcPr>
+          <w:p>
+            <w:pPr>
+              <w:jc w:val="center"/>
+            </w:pPr>
+            <w:r>
+              <w:rPr>
+                <w:rFonts w:ascii="Arial" w:cs="Arial" w:eastAsia="Arial" w:hAnsi="Arial"/>
+                <w:b/>
+                <w:bCs/>
+                <w:color w:val="0D9488"/>
+                <w:sz w:val="20"/>
+                <w:szCs w:val="20"/>
+              </w:rPr>
+              <w:t xml:space="preserve">High</w:t>
+            </w:r>
+          </w:p>
+        </w:tc>
+      </w:tr>
+      <w:tr>
+        <w:tc>
+          <w:tcPr>
+            <w:tcW w:type="dxa" w:w="480"/>
+            <w:tcBorders>
+              <w:top w:val="single" w:color="E2E8F0" w:sz="1"/>
+              <w:left w:val="single" w:color="E2E8F0" w:sz="1"/>
+              <w:bottom w:val="single" w:color="E2E8F0" w:sz="1"/>
+              <w:right w:val="single" w:color="E2E8F0" w:sz="1"/>
+            </w:tcBorders>
+            <w:shd w:fill="FFFFFF" w:val="clear"/>
+            <w:tcMar>
+              <w:top w:type="dxa" w:w="80"/>
+              <w:left w:type="dxa" w:w="120"/>
+              <w:bottom w:type="dxa" w:w="80"/>
+              <w:right w:type="dxa" w:w="120"/>
+            </w:tcMar>
+          </w:tcPr>
+          <w:p>
+            <w:pPr>
+              <w:jc w:val="center"/>
+            </w:pPr>
+            <w:r>
+              <w:rPr>
+                <w:rFonts w:ascii="Arial" w:cs="Arial" w:eastAsia="Arial" w:hAnsi="Arial"/>
+                <w:b/>
+                <w:bCs/>
+                <w:color w:val="0D9488"/>
+                <w:sz w:val="20"/>
+                <w:szCs w:val="20"/>
+              </w:rPr>
+              <w:t xml:space="preserve">8</w:t>
+            </w:r>
+          </w:p>
+        </w:tc>
+        <w:tc>
+          <w:tcPr>
+            <w:tcW w:type="dxa" w:w="3200"/>
+            <w:tcBorders>
+              <w:top w:val="single" w:color="E2E8F0" w:sz="1"/>
+              <w:left w:val="single" w:color="E2E8F0" w:sz="1"/>
+              <w:bottom w:val="single" w:color="E2E8F0" w:sz="1"/>
+              <w:right w:val="single" w:color="E2E8F0" w:sz="1"/>
+            </w:tcBorders>
+            <w:shd w:fill="FFFFFF" w:val="clear"/>
+            <w:tcMar>
+              <w:top w:type="dxa" w:w="80"/>
+              <w:left w:type="dxa" w:w="120"/>
+              <w:bottom w:type="dxa" w:w="80"/>
+              <w:right w:type="dxa" w:w="120"/>
+            </w:tcMar>
+          </w:tcPr>
+          <w:p>
+            <w:r>
+              <w:rPr>
+                <w:rFonts w:ascii="Arial" w:cs="Arial" w:eastAsia="Arial" w:hAnsi="Arial"/>
+                <w:b/>
+                <w:bCs/>
+                <w:color w:val="1E293B"/>
+                <w:sz w:val="20"/>
+                <w:szCs w:val="20"/>
+              </w:rPr>
+              <w:t xml:space="preserve">Proxmox Live Status</w:t>
+            </w:r>
+          </w:p>
+        </w:tc>
+        <w:tc>
+          <w:tcPr>
+            <w:tcW w:type="dxa" w:w="2880"/>
+            <w:tcBorders>
+              <w:top w:val="single" w:color="E2E8F0" w:sz="1"/>
+              <w:left w:val="single" w:color="E2E8F0" w:sz="1"/>
+              <w:bottom w:val="single" w:color="E2E8F0" w:sz="1"/>
+              <w:right w:val="single" w:color="E2E8F0" w:sz="1"/>
+            </w:tcBorders>
+            <w:shd w:fill="FFFFFF" w:val="clear"/>
+            <w:tcMar>
+              <w:top w:type="dxa" w:w="80"/>
+              <w:left w:type="dxa" w:w="120"/>
+              <w:bottom w:type="dxa" w:w="80"/>
+              <w:right w:type="dxa" w:w="120"/>
+            </w:tcMar>
+          </w:tcPr>
+          <w:p>
+            <w:r>
+              <w:rPr>
+                <w:rFonts w:ascii="Arial" w:cs="Arial" w:eastAsia="Arial" w:hAnsi="Arial"/>
+                <w:color w:val="64748B"/>
+                <w:sz w:val="20"/>
+                <w:szCs w:val="20"/>
+              </w:rPr>
+              <w:t xml:space="preserve">Real-time VM/LXC power state badges without leaving the IP manager</w:t>
+            </w:r>
+          </w:p>
+        </w:tc>
+        <w:tc>
+          <w:tcPr>
+            <w:tcW w:type="dxa" w:w="1400"/>
+            <w:tcBorders>
+              <w:top w:val="single" w:color="E2E8F0" w:sz="1"/>
+              <w:left w:val="single" w:color="E2E8F0" w:sz="1"/>
+              <w:bottom w:val="single" w:color="E2E8F0" w:sz="1"/>
+              <w:right w:val="single" w:color="E2E8F0" w:sz="1"/>
+            </w:tcBorders>
+            <w:shd w:fill="FFFFFF" w:val="clear"/>
+            <w:tcMar>
+              <w:top w:type="dxa" w:w="80"/>
+              <w:left w:type="dxa" w:w="120"/>
+              <w:bottom w:type="dxa" w:w="80"/>
+              <w:right w:type="dxa" w:w="120"/>
+            </w:tcMar>
+          </w:tcPr>
+          <w:p>
+            <w:pPr>
+              <w:jc w:val="center"/>
+            </w:pPr>
+            <w:r>
+              <w:rPr>
+                <w:rFonts w:ascii="Arial" w:cs="Arial" w:eastAsia="Arial" w:hAnsi="Arial"/>
+                <w:color w:val="1E293B"/>
+                <w:sz w:val="20"/>
+                <w:szCs w:val="20"/>
+              </w:rPr>
+              <w:t xml:space="preserve">High</w:t>
             </w:r>
           </w:p>
         </w:tc>

</xml_diff>

<commit_message>
docs: add Pi-hole v6 integration to roadmap
Phase 2: Pi-hole Import (v6) — one-shot import of Pi-hole v6 local DNS
records to populate or enrich existing IP entries. Server-side proxy,
same pattern as Proxmox Phase 1.

Phase 3: Pi-hole DNS Validation (v6) — periodic poll of Pi-hole v6 API
to compare stored hostnames against what Pi-hole actually resolves;
amber warning badge on any card where the two disagree.

Both the README and IP_Manager_Roadmap.docx updated.

Co-Authored-By: Claude Sonnet 4.6 <noreply@anthropic.com>
</commit_message>
<xml_diff>
--- a/IP_Manager_Roadmap.docx
+++ b/IP_Manager_Roadmap.docx
@@ -1838,6 +1838,104 @@
                 <w:sz w:val="20"/>
                 <w:szCs w:val="20"/>
               </w:rPr>
+              <w:t xml:space="preserve">Pi-hole Import (v6)</w:t>
+            </w:r>
+          </w:p>
+        </w:tc>
+        <w:tc>
+          <w:tcPr>
+            <w:tcW w:type="dxa" w:w="4560"/>
+            <w:tcBorders>
+              <w:top w:val="single" w:color="E2E8F0" w:sz="1"/>
+              <w:left w:val="single" w:color="E2E8F0" w:sz="1"/>
+              <w:bottom w:val="single" w:color="E2E8F0" w:sz="1"/>
+              <w:right w:val="single" w:color="E2E8F0" w:sz="1"/>
+            </w:tcBorders>
+            <w:shd w:fill="FFFFFF" w:val="clear"/>
+            <w:tcMar>
+              <w:top w:type="dxa" w:w="80"/>
+              <w:left w:type="dxa" w:w="120"/>
+              <w:bottom w:type="dxa" w:w="80"/>
+              <w:right w:type="dxa" w:w="120"/>
+            </w:tcMar>
+          </w:tcPr>
+          <w:p>
+            <w:r>
+              <w:rPr>
+                <w:rFonts w:ascii="Arial" w:cs="Arial" w:eastAsia="Arial" w:hAnsi="Arial"/>
+                <w:b w:val="false"/>
+                <w:bCs w:val="false"/>
+                <w:color w:val="1E293B"/>
+                <w:sz w:val="20"/>
+                <w:szCs w:val="20"/>
+              </w:rPr>
+              <w:t xml:space="preserve">One-shot import of Pi-hole v6 local DNS records via the Pi-hole v6 REST API — populates or enriches existing IP entries with hostnames already defined in Pi-hole. Proxied server-side to avoid CORS and TLS issues.</w:t>
+            </w:r>
+          </w:p>
+        </w:tc>
+        <w:tc>
+          <w:tcPr>
+            <w:tcW w:type="dxa" w:w="2000"/>
+            <w:tcBorders>
+              <w:top w:val="single" w:color="E2E8F0" w:sz="1"/>
+              <w:left w:val="single" w:color="E2E8F0" w:sz="1"/>
+              <w:bottom w:val="single" w:color="E2E8F0" w:sz="1"/>
+              <w:right w:val="single" w:color="E2E8F0" w:sz="1"/>
+            </w:tcBorders>
+            <w:shd w:fill="CCFBF1" w:val="clear"/>
+            <w:tcMar>
+              <w:top w:type="dxa" w:w="80"/>
+              <w:left w:type="dxa" w:w="120"/>
+              <w:bottom w:type="dxa" w:w="80"/>
+              <w:right w:type="dxa" w:w="120"/>
+            </w:tcMar>
+          </w:tcPr>
+          <w:p>
+            <w:pPr>
+              <w:jc w:val="center"/>
+            </w:pPr>
+            <w:r>
+              <w:rPr>
+                <w:rFonts w:ascii="Arial" w:cs="Arial" w:eastAsia="Arial" w:hAnsi="Arial"/>
+                <w:b/>
+                <w:bCs/>
+                <w:color w:val="0D9488"/>
+                <w:sz w:val="18"/>
+                <w:szCs w:val="18"/>
+              </w:rPr>
+              <w:t xml:space="preserve">HIGH</w:t>
+            </w:r>
+          </w:p>
+        </w:tc>
+      </w:tr>
+      <w:tr>
+        <w:tc>
+          <w:tcPr>
+            <w:tcW w:type="dxa" w:w="2800"/>
+            <w:tcBorders>
+              <w:top w:val="single" w:color="E2E8F0" w:sz="1"/>
+              <w:left w:val="single" w:color="E2E8F0" w:sz="1"/>
+              <w:bottom w:val="single" w:color="E2E8F0" w:sz="1"/>
+              <w:right w:val="single" w:color="E2E8F0" w:sz="1"/>
+            </w:tcBorders>
+            <w:shd w:fill="FFFFFF" w:val="clear"/>
+            <w:tcMar>
+              <w:top w:type="dxa" w:w="80"/>
+              <w:left w:type="dxa" w:w="120"/>
+              <w:bottom w:type="dxa" w:w="80"/>
+              <w:right w:type="dxa" w:w="120"/>
+            </w:tcMar>
+          </w:tcPr>
+          <w:p>
+            <w:r>
+              <w:rPr>
+                <w:rFonts w:ascii="Arial" w:cs="Arial" w:eastAsia="Arial" w:hAnsi="Arial"/>
+                <w:b/>
+                <w:bCs/>
+                <w:color w:val="1E293B"/>
+                <w:sz w:val="20"/>
+                <w:szCs w:val="20"/>
+              </w:rPr>
               <w:t xml:space="preserve">Change History / Audit ✅ Shipped v1.7</w:t>
             </w:r>
           </w:p>
@@ -3619,6 +3717,104 @@
                 <w:szCs w:val="20"/>
               </w:rPr>
               <w:t xml:space="preserve">Real-time VM and LXC power-state badges (running / stopped / paused) sourced from the Proxmox API — displayed directly on each IP card without needing to open the Proxmox UI.</w:t>
+            </w:r>
+          </w:p>
+        </w:tc>
+        <w:tc>
+          <w:tcPr>
+            <w:tcW w:type="dxa" w:w="2000"/>
+            <w:tcBorders>
+              <w:top w:val="single" w:color="E2E8F0" w:sz="1"/>
+              <w:left w:val="single" w:color="E2E8F0" w:sz="1"/>
+              <w:bottom w:val="single" w:color="E2E8F0" w:sz="1"/>
+              <w:right w:val="single" w:color="E2E8F0" w:sz="1"/>
+            </w:tcBorders>
+            <w:shd w:fill="CCFBF1" w:val="clear"/>
+            <w:tcMar>
+              <w:top w:type="dxa" w:w="80"/>
+              <w:left w:type="dxa" w:w="120"/>
+              <w:bottom w:type="dxa" w:w="80"/>
+              <w:right w:type="dxa" w:w="120"/>
+            </w:tcMar>
+          </w:tcPr>
+          <w:p>
+            <w:pPr>
+              <w:jc w:val="center"/>
+            </w:pPr>
+            <w:r>
+              <w:rPr>
+                <w:rFonts w:ascii="Arial" w:cs="Arial" w:eastAsia="Arial" w:hAnsi="Arial"/>
+                <w:b/>
+                <w:bCs/>
+                <w:color w:val="0D9488"/>
+                <w:sz w:val="18"/>
+                <w:szCs w:val="18"/>
+              </w:rPr>
+              <w:t xml:space="preserve">HIGH</w:t>
+            </w:r>
+          </w:p>
+        </w:tc>
+      </w:tr>
+      <w:tr>
+        <w:tc>
+          <w:tcPr>
+            <w:tcW w:type="dxa" w:w="2800"/>
+            <w:tcBorders>
+              <w:top w:val="single" w:color="E2E8F0" w:sz="1"/>
+              <w:left w:val="single" w:color="E2E8F0" w:sz="1"/>
+              <w:bottom w:val="single" w:color="E2E8F0" w:sz="1"/>
+              <w:right w:val="single" w:color="E2E8F0" w:sz="1"/>
+            </w:tcBorders>
+            <w:shd w:fill="FFFFFF" w:val="clear"/>
+            <w:tcMar>
+              <w:top w:type="dxa" w:w="80"/>
+              <w:left w:type="dxa" w:w="120"/>
+              <w:bottom w:type="dxa" w:w="80"/>
+              <w:right w:type="dxa" w:w="120"/>
+            </w:tcMar>
+          </w:tcPr>
+          <w:p>
+            <w:r>
+              <w:rPr>
+                <w:rFonts w:ascii="Arial" w:cs="Arial" w:eastAsia="Arial" w:hAnsi="Arial"/>
+                <w:b/>
+                <w:bCs/>
+                <w:color w:val="1E293B"/>
+                <w:sz w:val="20"/>
+                <w:szCs w:val="20"/>
+              </w:rPr>
+              <w:t xml:space="preserve">Pi-hole DNS Validation (v6)</w:t>
+            </w:r>
+          </w:p>
+        </w:tc>
+        <w:tc>
+          <w:tcPr>
+            <w:tcW w:type="dxa" w:w="4560"/>
+            <w:tcBorders>
+              <w:top w:val="single" w:color="E2E8F0" w:sz="1"/>
+              <w:left w:val="single" w:color="E2E8F0" w:sz="1"/>
+              <w:bottom w:val="single" w:color="E2E8F0" w:sz="1"/>
+              <w:right w:val="single" w:color="E2E8F0" w:sz="1"/>
+            </w:tcBorders>
+            <w:shd w:fill="FFFFFF" w:val="clear"/>
+            <w:tcMar>
+              <w:top w:type="dxa" w:w="80"/>
+              <w:left w:type="dxa" w:w="120"/>
+              <w:bottom w:type="dxa" w:w="80"/>
+              <w:right w:type="dxa" w:w="120"/>
+            </w:tcMar>
+          </w:tcPr>
+          <w:p>
+            <w:r>
+              <w:rPr>
+                <w:rFonts w:ascii="Arial" w:cs="Arial" w:eastAsia="Arial" w:hAnsi="Arial"/>
+                <w:b w:val="false"/>
+                <w:bCs w:val="false"/>
+                <w:color w:val="1E293B"/>
+                <w:sz w:val="20"/>
+                <w:szCs w:val="20"/>
+              </w:rPr>
+              <w:t xml:space="preserve">Poll the Pi-hole v6 API periodically and compare each entry’s hostname against what Pi-hole resolves. Any mismatch — e.g. the IP manager says plex.local → 192.168.0.50 but Pi-hole says 192.168.0.51 — shows an amber warning badge on the card so drift is visible at a glance.</w:t>
             </w:r>
           </w:p>
         </w:tc>

</xml_diff>

<commit_message>
docs: add ARP scanning to roadmap (Phase 2 + Phase 3)
Based on feedback from the home lab channel — ARP scanning is more
universal than Pi-hole since it works regardless of DNS/DHCP setup.

Phase 2: ARP Scan (one-shot) — on-demand server-side scan of the
configured subnet. Returns IP, MAC, and hostname where available;
cross-references existing entries to highlight untracked devices.
Lightweight by design (one broadcast packet per IP, ~15KB for a /24).

Phase 3: ARP Scan (background) — periodic scheduled scans, rate-limited
and subnet-scoped, that update a "last seen" timestamp per card and
surface newly appeared or disappeared devices automatically.

Co-Authored-By: Claude Sonnet 4.6 <noreply@anthropic.com>
</commit_message>
<xml_diff>
--- a/IP_Manager_Roadmap.docx
+++ b/IP_Manager_Roadmap.docx
@@ -1936,6 +1936,104 @@
                 <w:sz w:val="20"/>
                 <w:szCs w:val="20"/>
               </w:rPr>
+              <w:t xml:space="preserve">ARP Scan — One-Shot</w:t>
+            </w:r>
+          </w:p>
+        </w:tc>
+        <w:tc>
+          <w:tcPr>
+            <w:tcW w:type="dxa" w:w="4560"/>
+            <w:tcBorders>
+              <w:top w:val="single" w:color="E2E8F0" w:sz="1"/>
+              <w:left w:val="single" w:color="E2E8F0" w:sz="1"/>
+              <w:bottom w:val="single" w:color="E2E8F0" w:sz="1"/>
+              <w:right w:val="single" w:color="E2E8F0" w:sz="1"/>
+            </w:tcBorders>
+            <w:shd w:fill="FFFFFF" w:val="clear"/>
+            <w:tcMar>
+              <w:top w:type="dxa" w:w="80"/>
+              <w:left w:type="dxa" w:w="120"/>
+              <w:bottom w:type="dxa" w:w="80"/>
+              <w:right w:type="dxa" w:w="120"/>
+            </w:tcMar>
+          </w:tcPr>
+          <w:p>
+            <w:r>
+              <w:rPr>
+                <w:rFonts w:ascii="Arial" w:cs="Arial" w:eastAsia="Arial" w:hAnsi="Arial"/>
+                <w:b w:val="false"/>
+                <w:bCs w:val="false"/>
+                <w:color w:val="1E293B"/>
+                <w:sz w:val="20"/>
+                <w:szCs w:val="20"/>
+              </w:rPr>
+              <w:t xml:space="preserve">On-demand ARP scan of the configured subnet, run server-side (lightweight — one broadcast packet per IP, completes in under a second for a /24). Returns IP, MAC address, and hostname where available. Cross-references against existing entries to highlight untracked devices and unclaimed IPs for easy import.</w:t>
+            </w:r>
+          </w:p>
+        </w:tc>
+        <w:tc>
+          <w:tcPr>
+            <w:tcW w:type="dxa" w:w="2000"/>
+            <w:tcBorders>
+              <w:top w:val="single" w:color="E2E8F0" w:sz="1"/>
+              <w:left w:val="single" w:color="E2E8F0" w:sz="1"/>
+              <w:bottom w:val="single" w:color="E2E8F0" w:sz="1"/>
+              <w:right w:val="single" w:color="E2E8F0" w:sz="1"/>
+            </w:tcBorders>
+            <w:shd w:fill="CCFBF1" w:val="clear"/>
+            <w:tcMar>
+              <w:top w:type="dxa" w:w="80"/>
+              <w:left w:type="dxa" w:w="120"/>
+              <w:bottom w:type="dxa" w:w="80"/>
+              <w:right w:type="dxa" w:w="120"/>
+            </w:tcMar>
+          </w:tcPr>
+          <w:p>
+            <w:pPr>
+              <w:jc w:val="center"/>
+            </w:pPr>
+            <w:r>
+              <w:rPr>
+                <w:rFonts w:ascii="Arial" w:cs="Arial" w:eastAsia="Arial" w:hAnsi="Arial"/>
+                <w:b/>
+                <w:bCs/>
+                <w:color w:val="0D9488"/>
+                <w:sz w:val="18"/>
+                <w:szCs w:val="18"/>
+              </w:rPr>
+              <w:t xml:space="preserve">HIGH</w:t>
+            </w:r>
+          </w:p>
+        </w:tc>
+      </w:tr>
+      <w:tr>
+        <w:tc>
+          <w:tcPr>
+            <w:tcW w:type="dxa" w:w="2800"/>
+            <w:tcBorders>
+              <w:top w:val="single" w:color="E2E8F0" w:sz="1"/>
+              <w:left w:val="single" w:color="E2E8F0" w:sz="1"/>
+              <w:bottom w:val="single" w:color="E2E8F0" w:sz="1"/>
+              <w:right w:val="single" w:color="E2E8F0" w:sz="1"/>
+            </w:tcBorders>
+            <w:shd w:fill="FFFFFF" w:val="clear"/>
+            <w:tcMar>
+              <w:top w:type="dxa" w:w="80"/>
+              <w:left w:type="dxa" w:w="120"/>
+              <w:bottom w:type="dxa" w:w="80"/>
+              <w:right w:type="dxa" w:w="120"/>
+            </w:tcMar>
+          </w:tcPr>
+          <w:p>
+            <w:r>
+              <w:rPr>
+                <w:rFonts w:ascii="Arial" w:cs="Arial" w:eastAsia="Arial" w:hAnsi="Arial"/>
+                <w:b/>
+                <w:bCs/>
+                <w:color w:val="1E293B"/>
+                <w:sz w:val="20"/>
+                <w:szCs w:val="20"/>
+              </w:rPr>
               <w:t xml:space="preserve">Change History / Audit ✅ Shipped v1.7</w:t>
             </w:r>
           </w:p>
@@ -3815,6 +3913,104 @@
                 <w:szCs w:val="20"/>
               </w:rPr>
               <w:t xml:space="preserve">Poll the Pi-hole v6 API periodically and compare each entry’s hostname against what Pi-hole resolves. Any mismatch — e.g. the IP manager says plex.local → 192.168.0.50 but Pi-hole says 192.168.0.51 — shows an amber warning badge on the card so drift is visible at a glance.</w:t>
+            </w:r>
+          </w:p>
+        </w:tc>
+        <w:tc>
+          <w:tcPr>
+            <w:tcW w:type="dxa" w:w="2000"/>
+            <w:tcBorders>
+              <w:top w:val="single" w:color="E2E8F0" w:sz="1"/>
+              <w:left w:val="single" w:color="E2E8F0" w:sz="1"/>
+              <w:bottom w:val="single" w:color="E2E8F0" w:sz="1"/>
+              <w:right w:val="single" w:color="E2E8F0" w:sz="1"/>
+            </w:tcBorders>
+            <w:shd w:fill="CCFBF1" w:val="clear"/>
+            <w:tcMar>
+              <w:top w:type="dxa" w:w="80"/>
+              <w:left w:type="dxa" w:w="120"/>
+              <w:bottom w:type="dxa" w:w="80"/>
+              <w:right w:type="dxa" w:w="120"/>
+            </w:tcMar>
+          </w:tcPr>
+          <w:p>
+            <w:pPr>
+              <w:jc w:val="center"/>
+            </w:pPr>
+            <w:r>
+              <w:rPr>
+                <w:rFonts w:ascii="Arial" w:cs="Arial" w:eastAsia="Arial" w:hAnsi="Arial"/>
+                <w:b/>
+                <w:bCs/>
+                <w:color w:val="0D9488"/>
+                <w:sz w:val="18"/>
+                <w:szCs w:val="18"/>
+              </w:rPr>
+              <w:t xml:space="preserve">HIGH</w:t>
+            </w:r>
+          </w:p>
+        </w:tc>
+      </w:tr>
+      <w:tr>
+        <w:tc>
+          <w:tcPr>
+            <w:tcW w:type="dxa" w:w="2800"/>
+            <w:tcBorders>
+              <w:top w:val="single" w:color="E2E8F0" w:sz="1"/>
+              <w:left w:val="single" w:color="E2E8F0" w:sz="1"/>
+              <w:bottom w:val="single" w:color="E2E8F0" w:sz="1"/>
+              <w:right w:val="single" w:color="E2E8F0" w:sz="1"/>
+            </w:tcBorders>
+            <w:shd w:fill="FFFFFF" w:val="clear"/>
+            <w:tcMar>
+              <w:top w:type="dxa" w:w="80"/>
+              <w:left w:type="dxa" w:w="120"/>
+              <w:bottom w:type="dxa" w:w="80"/>
+              <w:right w:type="dxa" w:w="120"/>
+            </w:tcMar>
+          </w:tcPr>
+          <w:p>
+            <w:r>
+              <w:rPr>
+                <w:rFonts w:ascii="Arial" w:cs="Arial" w:eastAsia="Arial" w:hAnsi="Arial"/>
+                <w:b/>
+                <w:bCs/>
+                <w:color w:val="1E293B"/>
+                <w:sz w:val="20"/>
+                <w:szCs w:val="20"/>
+              </w:rPr>
+              <w:t xml:space="preserve">ARP Scan — Background</w:t>
+            </w:r>
+          </w:p>
+        </w:tc>
+        <w:tc>
+          <w:tcPr>
+            <w:tcW w:type="dxa" w:w="4560"/>
+            <w:tcBorders>
+              <w:top w:val="single" w:color="E2E8F0" w:sz="1"/>
+              <w:left w:val="single" w:color="E2E8F0" w:sz="1"/>
+              <w:bottom w:val="single" w:color="E2E8F0" w:sz="1"/>
+              <w:right w:val="single" w:color="E2E8F0" w:sz="1"/>
+            </w:tcBorders>
+            <w:shd w:fill="FFFFFF" w:val="clear"/>
+            <w:tcMar>
+              <w:top w:type="dxa" w:w="80"/>
+              <w:left w:type="dxa" w:w="120"/>
+              <w:bottom w:type="dxa" w:w="80"/>
+              <w:right w:type="dxa" w:w="120"/>
+            </w:tcMar>
+          </w:tcPr>
+          <w:p>
+            <w:r>
+              <w:rPr>
+                <w:rFonts w:ascii="Arial" w:cs="Arial" w:eastAsia="Arial" w:hAnsi="Arial"/>
+                <w:b w:val="false"/>
+                <w:bCs w:val="false"/>
+                <w:color w:val="1E293B"/>
+                <w:sz w:val="20"/>
+                <w:szCs w:val="20"/>
+              </w:rPr>
+              <w:t xml:space="preserve">Periodic scheduled ARP scans (rate-limited, scoped to the configured subnet) that update a “last seen” timestamp on each card and automatically surface newly appeared or disappeared devices without manual intervention.</w:t>
             </w:r>
           </w:p>
         </w:tc>

</xml_diff>

<commit_message>
docs: update README and roadmap to v1.11
README:
- Add v1.11 section: ARP scan, DHCP toggle, multi-network fix, credential fix
- Add v1.10 section: Proxmox import, tag management
- Mark ARP scan one-shot as ✅ shipped v1.11 in Phase 1 roadmap
- Mark DHCP toggle as ✅ shipped v1.11 in Phase 1 roadmap
- Remove ARP scan one-shot from Phase 2 (it shipped)
- Update install steps to mention arp-scan and permission setup
- Add DHCP toggle row to Network Configuration settings table

Roadmap docx:
- Phase 2 table: mark ARP Scan One-Shot as ✅ Shipped v1.11
- Priority Summary intro: update shipped list from v1.9 to v1.11,
  adding Proxmox import, tag management, ARP scan, and DHCP toggle

Co-Authored-By: Claude Sonnet 4.6 <noreply@anthropic.com>
</commit_message>
<xml_diff>
--- a/IP_Manager_Roadmap.docx
+++ b/IP_Manager_Roadmap.docx
@@ -1936,7 +1936,7 @@
                 <w:sz w:val="20"/>
                 <w:szCs w:val="20"/>
               </w:rPr>
-              <w:t xml:space="preserve">ARP Scan — One-Shot</w:t>
+              <w:t xml:space="preserve">ARP Scan — One-Shot ✅ Shipped v1.11</w:t>
             </w:r>
           </w:p>
         </w:tc>
@@ -4091,7 +4091,7 @@
           <w:sz w:val="22"/>
           <w:szCs w:val="22"/>
         </w:rPr>
-        <w:t xml:space="preserve">Tags, Sort Controls, Last Modified Date, Keyboard Shortcuts, /16 support, DHCP reservations anywhere, Clear All Data, subnet auto-normalisation, bulk selection and bulk edit, location management, free IPs in the main list, change history / audit log, multi-network / VLAN support, full backup and restore, hide-free-IPs toggle, and login authentication have all shipped (v1.4–v1.9). The iPad native app is in active development. The table below ranks the top remaining web app items by effort vs. impact.</w:t>
+        <w:t xml:space="preserve">Tags, Sort Controls, Last Modified Date, Keyboard Shortcuts, /16 support, DHCP reservations anywhere, Clear All Data, subnet auto-normalisation, bulk selection and bulk edit, location management, free IPs in the main list, change history / audit log, multi-network / VLAN support, full backup and restore, hide-free-IPs toggle, login authentication, Proxmox one-shot import, tag management, ARP network scan, and DHCP toggle have all shipped (v1.4–v1.11). The iPad native app is in active development. The table below ranks the top remaining web app items by effort vs. impact.</w:t>
       </w:r>
     </w:p>
     <w:p>

</xml_diff>

<commit_message>
docs: update README and roadmap to v1.12 (ping/reachability)
README:
- v1.12 feature section added
- Ping bullet added to "What It Does" list
- Phase 2 roadmap: Ping / Reachability marked ✅ shipped v1.12

Roadmap docx:
- Phase 2 table: Ping row title → "Shipped v1.12", description updated,
  status chip changed from HIGH → SHIPPED
- Priority Summary intro text updated to v1.4–v1.12
- Priority Summary table: Ping row marked as shipped v1.12

Co-Authored-By: Claude Sonnet 4.6 <noreply@anthropic.com>
</commit_message>
<xml_diff>
--- a/IP_Manager_Roadmap.docx
+++ b/IP_Manager_Roadmap.docx
@@ -1544,7 +1544,7 @@
                 <w:sz w:val="20"/>
                 <w:szCs w:val="20"/>
               </w:rPr>
-              <w:t xml:space="preserve">Ping / Reachability</w:t>
+              <w:t xml:space="preserve">Ping / Reachability ✅ Shipped v1.12</w:t>
             </w:r>
           </w:p>
         </w:tc>
@@ -1575,7 +1575,7 @@
                 <w:sz w:val="20"/>
                 <w:szCs w:val="20"/>
               </w:rPr>
-              <w:t xml:space="preserve">Run periodic ping sweeps (via the existing Node backend) to show which IPs are currently online with a live status indicator.</w:t>
+              <w:t xml:space="preserve">Shipped in v1.12. Coloured dot on every IP card and table row (green = online, red = offline). Server runs fping against all tracked IPs, caches results, and auto-refreshes every 60 s. Manual refresh button in header. Amber warning if fping is unavailable.</w:t>
             </w:r>
           </w:p>
         </w:tc>
@@ -1609,7 +1609,7 @@
                 <w:sz w:val="18"/>
                 <w:szCs w:val="18"/>
               </w:rPr>
-              <w:t xml:space="preserve">HIGH</w:t>
+              <w:t xml:space="preserve">SHIPPED</w:t>
             </w:r>
           </w:p>
         </w:tc>
@@ -4091,7 +4091,7 @@
           <w:sz w:val="22"/>
           <w:szCs w:val="22"/>
         </w:rPr>
-        <w:t xml:space="preserve">Tags, Sort Controls, Last Modified Date, Keyboard Shortcuts, /16 support, DHCP reservations anywhere, Clear All Data, subnet auto-normalisation, bulk selection and bulk edit, location management, free IPs in the main list, change history / audit log, multi-network / VLAN support, full backup and restore, hide-free-IPs toggle, login authentication, Proxmox one-shot import, tag management, ARP network scan, and DHCP toggle have all shipped (v1.4–v1.11). The iPad native app is in active development. The table below ranks the top remaining web app items by effort vs. impact.</w:t>
+        <w:t xml:space="preserve">Tags, Sort Controls, Last Modified Date, Keyboard Shortcuts, /16 support, DHCP reservations anywhere, Clear All Data, subnet auto-normalisation, bulk selection and bulk edit, location management, free IPs in the main list, change history / audit log, multi-network / VLAN support, full backup and restore, hide-free-IPs toggle, login authentication, Proxmox one-shot import, tag management, ARP network scan, DHCP toggle, and ping / reachability badges have all shipped (v1.4–v1.12). The iPad native app is in active development. The table below ranks the top remaining web app items by effort vs. impact.</w:t>
       </w:r>
     </w:p>
     <w:p>
@@ -4823,7 +4823,7 @@
                 <w:sz w:val="20"/>
                 <w:szCs w:val="20"/>
               </w:rPr>
-              <w:t xml:space="preserve">Ping / Reachability</w:t>
+              <w:t xml:space="preserve">Ping / Reachability ✅ Shipped v1.12</w:t>
             </w:r>
           </w:p>
         </w:tc>
@@ -4852,7 +4852,7 @@
                 <w:sz w:val="20"/>
                 <w:szCs w:val="20"/>
               </w:rPr>
-              <w:t xml:space="preserve">Adds live operational awareness with no new infrastructure</w:t>
+              <w:t xml:space="preserve">Live green/red dots on every IP, auto-poll every 60 s, manual refresh button — shipped v1.12</w:t>
             </w:r>
           </w:p>
         </w:tc>

</xml_diff>

<commit_message>
docs: update roadmap and README to v1.14; remove Pi-hole items
README:
- Add v1.13 (Help modal) and v1.14 (DNS lookup, logout fix) feature sections
- Phase 2 roadmap: mark Help modal and DNS lookup as shipped
- Remove Pi-hole import item; replace with Service health checks,
  Background ARP scan as next priorities
- Phase 3: remove Pi-hole DNS validation (superseded by v1.14)

Roadmap docx:
- Pi-hole Import row → DNS Reverse Lookup ✅ Shipped v1.14
- DNS Validation row → DNS Mismatch Detection ✅ Shipped v1.14 (SHIPPED status)
- Phase 3 Pi-hole DNS Validation → updated to reflect shipped in v1.14
- Priority Summary intro updated to reference v1.4–v1.14

Co-Authored-By: Claude Sonnet 4.6 <noreply@anthropic.com>
</commit_message>
<xml_diff>
--- a/IP_Manager_Roadmap.docx
+++ b/IP_Manager_Roadmap.docx
@@ -1047,7 +1047,7 @@
               <w:bottom w:val="single" w:color="E2E8F0" w:sz="1"/>
               <w:right w:val="single" w:color="E2E8F0" w:sz="1"/>
             </w:tcBorders>
-            <w:shd w:fill="FFFBEB" w:val="clear"/>
+            <w:shd w:fill="CCFBF1" w:val="clear"/>
             <w:tcMar>
               <w:top w:type="dxa" w:w="80"/>
               <w:left w:type="dxa" w:w="120"/>
@@ -1064,11 +1064,11 @@
                 <w:rFonts w:ascii="Arial" w:cs="Arial" w:eastAsia="Arial" w:hAnsi="Arial"/>
                 <w:b/>
                 <w:bCs/>
-                <w:color w:val="D97706"/>
+                <w:color w:val="0D9488"/>
                 <w:sz w:val="18"/>
                 <w:szCs w:val="18"/>
               </w:rPr>
-              <w:t xml:space="preserve">MED</w:t>
+              <w:t xml:space="preserve">SHIPPED</w:t>
             </w:r>
           </w:p>
         </w:tc>
@@ -1838,7 +1838,7 @@
                 <w:sz w:val="20"/>
                 <w:szCs w:val="20"/>
               </w:rPr>
-              <w:t xml:space="preserve">Pi-hole Import (v6)</w:t>
+              <w:t xml:space="preserve">DNS Reverse Lookup ✅ Shipped v1.14</w:t>
             </w:r>
           </w:p>
         </w:tc>
@@ -1869,7 +1869,7 @@
                 <w:sz w:val="20"/>
                 <w:szCs w:val="20"/>
               </w:rPr>
-              <w:t xml:space="preserve">One-shot import of Pi-hole v6 local DNS records via the Pi-hole v6 REST API — populates or enriches existing IP entries with hostnames already defined in Pi-hole. Proxied server-side to avoid CORS and TLS issues.</w:t>
+              <w:t xml:space="preserve">Shipped in v1.14. Reverse PTR lookup for every tracked IP using Node’s built-in dns.Resolver — no extra packages required. Configurable DNS server (blank = system default). Smart display: suppresses duplicates when PTR matches stored hostname; shows grey fill-in when no hostname stored; shows amber ⚠ DNS: warning on mismatch. Auto-refresh every 24 h; manual DNS button in header.</w:t>
             </w:r>
           </w:p>
         </w:tc>
@@ -2078,7 +2078,7 @@
               <w:bottom w:val="single" w:color="E2E8F0" w:sz="1"/>
               <w:right w:val="single" w:color="E2E8F0" w:sz="1"/>
             </w:tcBorders>
-            <w:shd w:fill="FFFBEB" w:val="clear"/>
+            <w:shd w:fill="CCFBF1" w:val="clear"/>
             <w:tcMar>
               <w:top w:type="dxa" w:w="80"/>
               <w:left w:type="dxa" w:w="120"/>
@@ -2095,11 +2095,11 @@
                 <w:rFonts w:ascii="Arial" w:cs="Arial" w:eastAsia="Arial" w:hAnsi="Arial"/>
                 <w:b/>
                 <w:bCs/>
-                <w:color w:val="D97706"/>
+                <w:color w:val="0D9488"/>
                 <w:sz w:val="18"/>
                 <w:szCs w:val="18"/>
               </w:rPr>
-              <w:t xml:space="preserve">MED</w:t>
+              <w:t xml:space="preserve">SHIPPED</w:t>
             </w:r>
           </w:p>
         </w:tc>
@@ -2176,7 +2176,7 @@
               <w:bottom w:val="single" w:color="E2E8F0" w:sz="1"/>
               <w:right w:val="single" w:color="E2E8F0" w:sz="1"/>
             </w:tcBorders>
-            <w:shd w:fill="FFFBEB" w:val="clear"/>
+            <w:shd w:fill="CCFBF1" w:val="clear"/>
             <w:tcMar>
               <w:top w:type="dxa" w:w="80"/>
               <w:left w:type="dxa" w:w="120"/>
@@ -2193,11 +2193,11 @@
                 <w:rFonts w:ascii="Arial" w:cs="Arial" w:eastAsia="Arial" w:hAnsi="Arial"/>
                 <w:b/>
                 <w:bCs/>
-                <w:color w:val="D97706"/>
+                <w:color w:val="0D9488"/>
                 <w:sz w:val="18"/>
                 <w:szCs w:val="18"/>
               </w:rPr>
-              <w:t xml:space="preserve">MED</w:t>
+              <w:t xml:space="preserve">SHIPPED</w:t>
             </w:r>
           </w:p>
         </w:tc>
@@ -2230,7 +2230,7 @@
                 <w:sz w:val="20"/>
                 <w:szCs w:val="20"/>
               </w:rPr>
-              <w:t xml:space="preserve">DNS Validation</w:t>
+              <w:t xml:space="preserve">DNS Mismatch Detection ✅ Shipped v1.14</w:t>
             </w:r>
           </w:p>
         </w:tc>
@@ -2261,7 +2261,7 @@
                 <w:sz w:val="20"/>
                 <w:szCs w:val="20"/>
               </w:rPr>
-              <w:t xml:space="preserve">Attempt to resolve the hostname for each entry and flag mismatches between the stored IP and the resolved address.</w:t>
+              <w:t xml:space="preserve">Shipped in v1.14 as part of DNS Reverse Lookup. PTR results are compared against stored hostnames — mismatches shown as amber ⚠ DNS: warning badges on cards and table rows. Matches are silently suppressed to avoid duplication.</w:t>
             </w:r>
           </w:p>
         </w:tc>
@@ -2274,7 +2274,7 @@
               <w:bottom w:val="single" w:color="E2E8F0" w:sz="1"/>
               <w:right w:val="single" w:color="E2E8F0" w:sz="1"/>
             </w:tcBorders>
-            <w:shd w:fill="FFFBEB" w:val="clear"/>
+            <w:shd w:fill="CCFBF1" w:val="clear"/>
             <w:tcMar>
               <w:top w:type="dxa" w:w="80"/>
               <w:left w:type="dxa" w:w="120"/>
@@ -2291,11 +2291,11 @@
                 <w:rFonts w:ascii="Arial" w:cs="Arial" w:eastAsia="Arial" w:hAnsi="Arial"/>
                 <w:b/>
                 <w:bCs/>
-                <w:color w:val="D97706"/>
+                <w:color w:val="0D9488"/>
                 <w:sz w:val="18"/>
                 <w:szCs w:val="18"/>
               </w:rPr>
-              <w:t xml:space="preserve">MED</w:t>
+              <w:t xml:space="preserve">SHIPPED</w:t>
             </w:r>
           </w:p>
         </w:tc>
@@ -3337,7 +3337,7 @@
               <w:bottom w:val="single" w:color="E2E8F0" w:sz="1"/>
               <w:right w:val="single" w:color="E2E8F0" w:sz="1"/>
             </w:tcBorders>
-            <w:shd w:fill="FFFBEB" w:val="clear"/>
+            <w:shd w:fill="CCFBF1" w:val="clear"/>
             <w:tcMar>
               <w:top w:type="dxa" w:w="80"/>
               <w:left w:type="dxa" w:w="120"/>
@@ -3354,11 +3354,11 @@
                 <w:rFonts w:ascii="Arial" w:cs="Arial" w:eastAsia="Arial" w:hAnsi="Arial"/>
                 <w:b/>
                 <w:bCs/>
-                <w:color w:val="D97706"/>
+                <w:color w:val="0D9488"/>
                 <w:sz w:val="18"/>
                 <w:szCs w:val="18"/>
               </w:rPr>
-              <w:t xml:space="preserve">MED</w:t>
+              <w:t xml:space="preserve">SHIPPED</w:t>
             </w:r>
           </w:p>
         </w:tc>
@@ -3435,7 +3435,7 @@
               <w:bottom w:val="single" w:color="E2E8F0" w:sz="1"/>
               <w:right w:val="single" w:color="E2E8F0" w:sz="1"/>
             </w:tcBorders>
-            <w:shd w:fill="FFFBEB" w:val="clear"/>
+            <w:shd w:fill="CCFBF1" w:val="clear"/>
             <w:tcMar>
               <w:top w:type="dxa" w:w="80"/>
               <w:left w:type="dxa" w:w="120"/>
@@ -3452,11 +3452,11 @@
                 <w:rFonts w:ascii="Arial" w:cs="Arial" w:eastAsia="Arial" w:hAnsi="Arial"/>
                 <w:b/>
                 <w:bCs/>
-                <w:color w:val="D97706"/>
+                <w:color w:val="0D9488"/>
                 <w:sz w:val="18"/>
                 <w:szCs w:val="18"/>
               </w:rPr>
-              <w:t xml:space="preserve">MED</w:t>
+              <w:t xml:space="preserve">SHIPPED</w:t>
             </w:r>
           </w:p>
         </w:tc>
@@ -3533,7 +3533,7 @@
               <w:bottom w:val="single" w:color="E2E8F0" w:sz="1"/>
               <w:right w:val="single" w:color="E2E8F0" w:sz="1"/>
             </w:tcBorders>
-            <w:shd w:fill="FFFBEB" w:val="clear"/>
+            <w:shd w:fill="CCFBF1" w:val="clear"/>
             <w:tcMar>
               <w:top w:type="dxa" w:w="80"/>
               <w:left w:type="dxa" w:w="120"/>
@@ -3550,11 +3550,11 @@
                 <w:rFonts w:ascii="Arial" w:cs="Arial" w:eastAsia="Arial" w:hAnsi="Arial"/>
                 <w:b/>
                 <w:bCs/>
-                <w:color w:val="D97706"/>
+                <w:color w:val="0D9488"/>
                 <w:sz w:val="18"/>
                 <w:szCs w:val="18"/>
               </w:rPr>
-              <w:t xml:space="preserve">MED</w:t>
+              <w:t xml:space="preserve">SHIPPED</w:t>
             </w:r>
           </w:p>
         </w:tc>
@@ -3631,7 +3631,7 @@
               <w:bottom w:val="single" w:color="E2E8F0" w:sz="1"/>
               <w:right w:val="single" w:color="E2E8F0" w:sz="1"/>
             </w:tcBorders>
-            <w:shd w:fill="FFFBEB" w:val="clear"/>
+            <w:shd w:fill="CCFBF1" w:val="clear"/>
             <w:tcMar>
               <w:top w:type="dxa" w:w="80"/>
               <w:left w:type="dxa" w:w="120"/>
@@ -3648,11 +3648,11 @@
                 <w:rFonts w:ascii="Arial" w:cs="Arial" w:eastAsia="Arial" w:hAnsi="Arial"/>
                 <w:b/>
                 <w:bCs/>
-                <w:color w:val="D97706"/>
+                <w:color w:val="0D9488"/>
                 <w:sz w:val="18"/>
                 <w:szCs w:val="18"/>
               </w:rPr>
-              <w:t xml:space="preserve">MED</w:t>
+              <w:t xml:space="preserve">SHIPPED</w:t>
             </w:r>
           </w:p>
         </w:tc>
@@ -3729,7 +3729,7 @@
               <w:bottom w:val="single" w:color="E2E8F0" w:sz="1"/>
               <w:right w:val="single" w:color="E2E8F0" w:sz="1"/>
             </w:tcBorders>
-            <w:shd w:fill="FFFBEB" w:val="clear"/>
+            <w:shd w:fill="CCFBF1" w:val="clear"/>
             <w:tcMar>
               <w:top w:type="dxa" w:w="80"/>
               <w:left w:type="dxa" w:w="120"/>
@@ -3746,11 +3746,11 @@
                 <w:rFonts w:ascii="Arial" w:cs="Arial" w:eastAsia="Arial" w:hAnsi="Arial"/>
                 <w:b/>
                 <w:bCs/>
-                <w:color w:val="D97706"/>
+                <w:color w:val="0D9488"/>
                 <w:sz w:val="18"/>
                 <w:szCs w:val="18"/>
               </w:rPr>
-              <w:t xml:space="preserve">MED</w:t>
+              <w:t xml:space="preserve">SHIPPED</w:t>
             </w:r>
           </w:p>
         </w:tc>
@@ -3881,7 +3881,7 @@
                 <w:sz w:val="20"/>
                 <w:szCs w:val="20"/>
               </w:rPr>
-              <w:t xml:space="preserve">Pi-hole DNS Validation (v6)</w:t>
+              <w:t xml:space="preserve">DNS Mismatch Detection ✅ Shipped v1.14</w:t>
             </w:r>
           </w:p>
         </w:tc>
@@ -3912,7 +3912,7 @@
                 <w:sz w:val="20"/>
                 <w:szCs w:val="20"/>
               </w:rPr>
-              <w:t xml:space="preserve">Poll the Pi-hole v6 API periodically and compare each entry’s hostname against what Pi-hole resolves. Any mismatch — e.g. the IP manager says plex.local → 192.168.0.50 but Pi-hole says 192.168.0.51 — shows an amber warning badge on the card so drift is visible at a glance.</w:t>
+              <w:t xml:space="preserve">Shipped ahead of schedule in v1.14 (Phase 2). Uses standard reverse DNS PTR lookups against any configured DNS server rather than requiring Pi-hole specifically — works with any resolver including Pi-hole, Unbound, or a home router.</w:t>
             </w:r>
           </w:p>
         </w:tc>

</xml_diff>

<commit_message>
roadmap: remove PWA, add iOS native app as long-term vision
PWA/Offline Support removed from Phase 1 — offline mode adds no value
when the app requires network access to reach the LXC anyway.

iOS Native App added to Phase 3 as a longer-term aspiration: native
iPhone/iPad app for at-a-glance network status and quick IP lookups.
Updated in README.md and IP_Manager_Roadmap.docx (Phase 3 table,
Priority Summary, and Phase 1 completion note).

Co-Authored-By: Claude Sonnet 4.6 <noreply@anthropic.com>
</commit_message>
<xml_diff>
--- a/IP_Manager_Roadmap.docx
+++ b/IP_Manager_Roadmap.docx
@@ -855,7 +855,7 @@
           <w:sz w:val="22"/>
           <w:szCs w:val="22"/>
         </w:rPr>
-        <w:t xml:space="preserve">Tags, Sort Controls, Last Modified Date, Keyboard Shortcuts, Bulk Operations, Location Management, Free IPs in main list, Change History, Multi-Network/VLAN support, Backup &amp; Restore, Hide-Free-IPs toggle, Login Authentication (v1.9), and Proxmox one-shot import (v1.10) all shipped in v1.4–v1.10. The only remaining Phase 1 item is PWA/Offline Support.</w:t>
+        <w:t xml:space="preserve">Tags, Sort Controls, Last Modified Date, Keyboard Shortcuts, Bulk Operations, Location Management, Free IPs in main list, Change History, Multi-Network/VLAN support, Backup &amp; Restore, Hide-Free-IPs toggle, Login Authentication (v1.9), Proxmox one-shot import (v1.10), ARP Scan and DHCP toggle (v1.11) all shipped in v1.4–v1.11. Phase 1 is now complete.</w:t>
       </w:r>
     </w:p>
     <w:p>
@@ -975,104 +975,6 @@
           </w:p>
         </w:tc>
       </w:tr>
-      <w:tr>
-        <w:tc>
-          <w:tcPr>
-            <w:tcW w:type="dxa" w:w="2800"/>
-            <w:tcBorders>
-              <w:top w:val="single" w:color="E2E8F0" w:sz="1"/>
-              <w:left w:val="single" w:color="E2E8F0" w:sz="1"/>
-              <w:bottom w:val="single" w:color="E2E8F0" w:sz="1"/>
-              <w:right w:val="single" w:color="E2E8F0" w:sz="1"/>
-            </w:tcBorders>
-            <w:shd w:fill="FFFFFF" w:val="clear"/>
-            <w:tcMar>
-              <w:top w:type="dxa" w:w="80"/>
-              <w:left w:type="dxa" w:w="120"/>
-              <w:bottom w:type="dxa" w:w="80"/>
-              <w:right w:type="dxa" w:w="120"/>
-            </w:tcMar>
-          </w:tcPr>
-          <w:p>
-            <w:r>
-              <w:rPr>
-                <w:rFonts w:ascii="Arial" w:cs="Arial" w:eastAsia="Arial" w:hAnsi="Arial"/>
-                <w:b/>
-                <w:bCs/>
-                <w:color w:val="1E293B"/>
-                <w:sz w:val="20"/>
-                <w:szCs w:val="20"/>
-              </w:rPr>
-              <w:t xml:space="preserve">PWA / Offline Support</w:t>
-            </w:r>
-          </w:p>
-        </w:tc>
-        <w:tc>
-          <w:tcPr>
-            <w:tcW w:type="dxa" w:w="4560"/>
-            <w:tcBorders>
-              <w:top w:val="single" w:color="E2E8F0" w:sz="1"/>
-              <w:left w:val="single" w:color="E2E8F0" w:sz="1"/>
-              <w:bottom w:val="single" w:color="E2E8F0" w:sz="1"/>
-              <w:right w:val="single" w:color="E2E8F0" w:sz="1"/>
-            </w:tcBorders>
-            <w:shd w:fill="FFFFFF" w:val="clear"/>
-            <w:tcMar>
-              <w:top w:type="dxa" w:w="80"/>
-              <w:left w:type="dxa" w:w="120"/>
-              <w:bottom w:type="dxa" w:w="80"/>
-              <w:right w:type="dxa" w:w="120"/>
-            </w:tcMar>
-          </w:tcPr>
-          <w:p>
-            <w:r>
-              <w:rPr>
-                <w:rFonts w:ascii="Arial" w:cs="Arial" w:eastAsia="Arial" w:hAnsi="Arial"/>
-                <w:b w:val="false"/>
-                <w:bCs w:val="false"/>
-                <w:color w:val="1E293B"/>
-                <w:sz w:val="20"/>
-                <w:szCs w:val="20"/>
-              </w:rPr>
-              <w:t xml:space="preserve">Add a service worker so the app works offline and can be installed to the home screen like a native app.</w:t>
-            </w:r>
-          </w:p>
-        </w:tc>
-        <w:tc>
-          <w:tcPr>
-            <w:tcW w:type="dxa" w:w="2000"/>
-            <w:tcBorders>
-              <w:top w:val="single" w:color="E2E8F0" w:sz="1"/>
-              <w:left w:val="single" w:color="E2E8F0" w:sz="1"/>
-              <w:bottom w:val="single" w:color="E2E8F0" w:sz="1"/>
-              <w:right w:val="single" w:color="E2E8F0" w:sz="1"/>
-            </w:tcBorders>
-            <w:shd w:fill="CCFBF1" w:val="clear"/>
-            <w:tcMar>
-              <w:top w:type="dxa" w:w="80"/>
-              <w:left w:type="dxa" w:w="120"/>
-              <w:bottom w:type="dxa" w:w="80"/>
-              <w:right w:type="dxa" w:w="120"/>
-            </w:tcMar>
-          </w:tcPr>
-          <w:p>
-            <w:pPr>
-              <w:jc w:val="center"/>
-            </w:pPr>
-            <w:r>
-              <w:rPr>
-                <w:rFonts w:ascii="Arial" w:cs="Arial" w:eastAsia="Arial" w:hAnsi="Arial"/>
-                <w:b/>
-                <w:bCs/>
-                <w:color w:val="0D9488"/>
-                <w:sz w:val="18"/>
-                <w:szCs w:val="18"/>
-              </w:rPr>
-              <w:t xml:space="preserve">SHIPPED</w:t>
-            </w:r>
-          </w:p>
-        </w:tc>
-      </w:tr>
     </w:tbl>
     <w:p>
       <w:pPr>
@@ -4045,6 +3947,104 @@
                 <w:szCs w:val="18"/>
               </w:rPr>
               <w:t xml:space="preserve">HIGH</w:t>
+            </w:r>
+          </w:p>
+        </w:tc>
+      </w:tr>
+      <w:tr>
+        <w:tc>
+          <w:tcPr>
+            <w:tcW w:type="dxa" w:w="2800"/>
+            <w:tcBorders>
+              <w:top w:val="single" w:color="E2E8F0" w:sz="1"/>
+              <w:left w:val="single" w:color="E2E8F0" w:sz="1"/>
+              <w:bottom w:val="single" w:color="E2E8F0" w:sz="1"/>
+              <w:right w:val="single" w:color="E2E8F0" w:sz="1"/>
+            </w:tcBorders>
+            <w:shd w:fill="FFFFFF" w:val="clear"/>
+            <w:tcMar>
+              <w:top w:type="dxa" w:w="80"/>
+              <w:left w:type="dxa" w:w="120"/>
+              <w:bottom w:type="dxa" w:w="80"/>
+              <w:right w:type="dxa" w:w="120"/>
+            </w:tcMar>
+          </w:tcPr>
+          <w:p>
+            <w:r>
+              <w:rPr>
+                <w:rFonts w:ascii="Arial" w:cs="Arial" w:eastAsia="Arial" w:hAnsi="Arial"/>
+                <w:b/>
+                <w:bCs/>
+                <w:color w:val="1E293B"/>
+                <w:sz w:val="20"/>
+                <w:szCs w:val="20"/>
+              </w:rPr>
+              <w:t xml:space="preserve">iOS Native App</w:t>
+            </w:r>
+          </w:p>
+        </w:tc>
+        <w:tc>
+          <w:tcPr>
+            <w:tcW w:type="dxa" w:w="4560"/>
+            <w:tcBorders>
+              <w:top w:val="single" w:color="E2E8F0" w:sz="1"/>
+              <w:left w:val="single" w:color="E2E8F0" w:sz="1"/>
+              <w:bottom w:val="single" w:color="E2E8F0" w:sz="1"/>
+              <w:right w:val="single" w:color="E2E8F0" w:sz="1"/>
+            </w:tcBorders>
+            <w:shd w:fill="FFFFFF" w:val="clear"/>
+            <w:tcMar>
+              <w:top w:type="dxa" w:w="80"/>
+              <w:left w:type="dxa" w:w="120"/>
+              <w:bottom w:type="dxa" w:w="80"/>
+              <w:right w:type="dxa" w:w="120"/>
+            </w:tcMar>
+          </w:tcPr>
+          <w:p>
+            <w:r>
+              <w:rPr>
+                <w:rFonts w:ascii="Arial" w:cs="Arial" w:eastAsia="Arial" w:hAnsi="Arial"/>
+                <w:b w:val="false"/>
+                <w:bCs w:val="false"/>
+                <w:color w:val="1E293B"/>
+                <w:sz w:val="20"/>
+                <w:szCs w:val="20"/>
+              </w:rPr>
+              <w:t xml:space="preserve">Native iPhone and iPad app for at-a-glance network status, quick IP lookups, and one-tap device access — no browser required.</w:t>
+            </w:r>
+          </w:p>
+        </w:tc>
+        <w:tc>
+          <w:tcPr>
+            <w:tcW w:type="dxa" w:w="2000"/>
+            <w:tcBorders>
+              <w:top w:val="single" w:color="E2E8F0" w:sz="1"/>
+              <w:left w:val="single" w:color="E2E8F0" w:sz="1"/>
+              <w:bottom w:val="single" w:color="E2E8F0" w:sz="1"/>
+              <w:right w:val="single" w:color="E2E8F0" w:sz="1"/>
+            </w:tcBorders>
+            <w:shd w:fill="E0F2FE" w:val="clear"/>
+            <w:tcMar>
+              <w:top w:type="dxa" w:w="80"/>
+              <w:left w:type="dxa" w:w="120"/>
+              <w:bottom w:type="dxa" w:w="80"/>
+              <w:right w:type="dxa" w:w="120"/>
+            </w:tcMar>
+          </w:tcPr>
+          <w:p>
+            <w:pPr>
+              <w:jc w:val="center"/>
+            </w:pPr>
+            <w:r>
+              <w:rPr>
+                <w:rFonts w:ascii="Arial" w:cs="Arial" w:eastAsia="Arial" w:hAnsi="Arial"/>
+                <w:b/>
+                <w:bCs/>
+                <w:color w:val="0369A1"/>
+                <w:sz w:val="18"/>
+                <w:szCs w:val="18"/>
+              </w:rPr>
+              <w:t xml:space="preserve">FUTURE</w:t>
             </w:r>
           </w:p>
         </w:tc>
@@ -4985,7 +4985,7 @@
                 <w:sz w:val="20"/>
                 <w:szCs w:val="20"/>
               </w:rPr>
-              <w:t xml:space="preserve">PWA / Offline Support</w:t>
+              <w:t xml:space="preserve">iOS Native App</w:t>
             </w:r>
           </w:p>
         </w:tc>
@@ -5014,7 +5014,7 @@
                 <w:sz w:val="20"/>
                 <w:szCs w:val="20"/>
               </w:rPr>
-              <w:t xml:space="preserve">Install to home screen; works without network access</w:t>
+              <w:t xml:space="preserve">Native iPhone/iPad app for network status and IP lookups on the go</w:t>
             </w:r>
           </w:p>
         </w:tc>
@@ -5046,7 +5046,7 @@
                 <w:sz w:val="20"/>
                 <w:szCs w:val="20"/>
               </w:rPr>
-              <w:t xml:space="preserve">Med</w:t>
+              <w:t xml:space="preserve">Low</w:t>
             </w:r>
           </w:p>
         </w:tc>
@@ -5074,13 +5074,11 @@
             <w:r>
               <w:rPr>
                 <w:rFonts w:ascii="Arial" w:cs="Arial" w:eastAsia="Arial" w:hAnsi="Arial"/>
-                <w:b/>
-                <w:bCs/>
-                <w:color w:val="0D9488"/>
-                <w:sz w:val="20"/>
-                <w:szCs w:val="20"/>
-              </w:rPr>
-              <w:t xml:space="preserve">High</w:t>
+                <w:color w:val="1E293B"/>
+                <w:sz w:val="20"/>
+                <w:szCs w:val="20"/>
+              </w:rPr>
+              <w:t xml:space="preserve">Med</w:t>
             </w:r>
           </w:p>
         </w:tc>

</xml_diff>

<commit_message>
docs: update all documentation for v1.16
- README: remove stale v1.15 section (already in CHANGELOG); only current version shown
- Help modal: add "Multiple IPs per Host" section explaining linking, display, unlinking, and Proxmox auto-grouping
- Roadmap: mark Multiple IPs per Host as SHIPPED v1.16 in both Phase 2 table and Priority Summary; update Priority Summary intro text to reflect v1.4–v1.16 shipments

Co-Authored-By: Claude Sonnet 4.6 <noreply@anthropic.com>
</commit_message>
<xml_diff>
--- a/IP_Manager_Roadmap.docx
+++ b/IP_Manager_Roadmap.docx
@@ -1250,7 +1250,7 @@
                 <w:sz w:val="20"/>
                 <w:szCs w:val="20"/>
               </w:rPr>
-              <w:t xml:space="preserve">Multiple IPs per Host</w:t>
+              <w:t xml:space="preserve">Multiple IPs per Host ✅ Shipped v1.16</w:t>
             </w:r>
           </w:p>
         </w:tc>
@@ -1281,7 +1281,7 @@
                 <w:sz w:val="20"/>
                 <w:szCs w:val="20"/>
               </w:rPr>
-              <w:t xml:space="preserve">Allow a single host/VM to have more than one IP address — e.g. a server on two VLANs, a VM with a management NIC and a data NIC, or a container with both a static and a DHCP lease. Prerequisite for VLAN support done properly.</w:t>
+              <w:t xml:space="preserve">Shipped in v1.16 (Option A — hostId grouping). Open the Edit modal for any entry to link secondary IPs to it. Primary cards show linked IPs as blue chips; secondary cards show a → Primary label. Proxmox import auto-groups multi-NIC VMs and LXCs. The hostId data model is additive — existing data is unaffected; clean upgrade path to a richer model later.</w:t>
             </w:r>
           </w:p>
         </w:tc>
@@ -1315,7 +1315,7 @@
                 <w:sz w:val="18"/>
                 <w:szCs w:val="18"/>
               </w:rPr>
-              <w:t xml:space="preserve">HIGH</w:t>
+              <w:t xml:space="preserve">SHIPPED</w:t>
             </w:r>
           </w:p>
         </w:tc>
@@ -4091,7 +4091,7 @@
           <w:sz w:val="22"/>
           <w:szCs w:val="22"/>
         </w:rPr>
-        <w:t xml:space="preserve">Tags, Sort Controls, Last Modified Date, Keyboard Shortcuts, /16 support, DHCP reservations anywhere, Clear All Data, subnet auto-normalisation, bulk selection and bulk edit, location management, free IPs in the main list, change history / audit log, multi-network / VLAN support, full backup and restore, hide-free-IPs toggle, login authentication, Proxmox one-shot import, tag management, ARP network scan, DHCP toggle, and ping / reachability badges have all shipped (v1.4–v1.12). The iPad native app is in active development. The table below ranks the top remaining web app items by effort vs. impact.</w:t>
+        <w:t xml:space="preserve">Tags, Sort Controls, Last Modified Date, Keyboard Shortcuts, /16 support, DHCP reservations anywhere, Clear All Data, subnet auto-normalisation, bulk selection and bulk edit, location management, free IPs in the main list, change history / audit log, multi-network / VLAN support, full backup and restore, hide-free-IPs toggle, login authentication, Proxmox one-shot import, tag management, ARP network scan, DHCP toggle, ping / reachability badges, Help &amp; Reference modal, DNS reverse lookup, Proxmox scheduled sync, and multiple IPs per host have all shipped (v1.4–v1.16). The table below ranks the top remaining web app items by effort vs. impact.</w:t>
       </w:r>
     </w:p>
     <w:p>
@@ -4499,7 +4499,7 @@
                 <w:sz w:val="20"/>
                 <w:szCs w:val="20"/>
               </w:rPr>
-              <w:t xml:space="preserve">Multiple IPs per Host</w:t>
+              <w:t xml:space="preserve">Multiple IPs per Host ✅ Shipped v1.16</w:t>
             </w:r>
           </w:p>
         </w:tc>

</xml_diff>